<commit_message>
docs: Se agregan los documentos grupales fase 2
</commit_message>
<xml_diff>
--- a/FASE 2/Evidencias Grupales/2.6_GuiaEstudiante_Fase 2_Informe Final Proyecto APT.docx
+++ b/FASE 2/Evidencias Grupales/2.6_GuiaEstudiante_Fase 2_Informe Final Proyecto APT.docx
@@ -1,6 +1,6 @@
 
 <file path=word/document.xml><?xml version="1.0" encoding="utf-8"?>
-<w:document xmlns:wpc="http://schemas.microsoft.com/office/word/2010/wordprocessingCanvas" xmlns:cx="http://schemas.microsoft.com/office/drawing/2014/chartex" xmlns:mc="http://schemas.openxmlformats.org/markup-compatibility/2006" xmlns:o="urn:schemas-microsoft-com:office:office" xmlns:r="http://schemas.openxmlformats.org/officeDocument/2006/relationships" xmlns:m="http://schemas.openxmlformats.org/officeDocument/2006/math" xmlns:v="urn:schemas-microsoft-com:vml" xmlns:wp14="http://schemas.microsoft.com/office/word/2010/wordprocessingDrawing" xmlns:wp="http://schemas.openxmlformats.org/drawingml/2006/wordprocessingDrawing" xmlns:w10="urn:schemas-microsoft-com:office:word" xmlns:w="http://schemas.openxmlformats.org/wordprocessingml/2006/main" xmlns:w14="http://schemas.microsoft.com/office/word/2010/wordml" xmlns:w15="http://schemas.microsoft.com/office/word/2012/wordml" xmlns:w16se="http://schemas.microsoft.com/office/word/2015/wordml/symex" xmlns:wpg="http://schemas.microsoft.com/office/word/2010/wordprocessingGroup" xmlns:wpi="http://schemas.microsoft.com/office/word/2010/wordprocessingInk" xmlns:wne="http://schemas.microsoft.com/office/word/2006/wordml" xmlns:wps="http://schemas.microsoft.com/office/word/2010/wordprocessingShape" mc:Ignorable="w14 w15 w16se wp14">
+<w:document xmlns:wpc="http://schemas.microsoft.com/office/word/2010/wordprocessingCanvas" xmlns:cx="http://schemas.microsoft.com/office/drawing/2014/chartex" xmlns:cx1="http://schemas.microsoft.com/office/drawing/2015/9/8/chartex" xmlns:cx2="http://schemas.microsoft.com/office/drawing/2015/10/21/chartex" xmlns:cx3="http://schemas.microsoft.com/office/drawing/2016/5/9/chartex" xmlns:cx4="http://schemas.microsoft.com/office/drawing/2016/5/10/chartex" xmlns:cx5="http://schemas.microsoft.com/office/drawing/2016/5/11/chartex" xmlns:cx6="http://schemas.microsoft.com/office/drawing/2016/5/12/chartex" xmlns:cx7="http://schemas.microsoft.com/office/drawing/2016/5/13/chartex" xmlns:cx8="http://schemas.microsoft.com/office/drawing/2016/5/14/chartex" xmlns:mc="http://schemas.openxmlformats.org/markup-compatibility/2006" xmlns:aink="http://schemas.microsoft.com/office/drawing/2016/ink" xmlns:am3d="http://schemas.microsoft.com/office/drawing/2017/model3d" xmlns:o="urn:schemas-microsoft-com:office:office" xmlns:oel="http://schemas.microsoft.com/office/2019/extlst" xmlns:r="http://schemas.openxmlformats.org/officeDocument/2006/relationships" xmlns:m="http://schemas.openxmlformats.org/officeDocument/2006/math" xmlns:v="urn:schemas-microsoft-com:vml" xmlns:wp14="http://schemas.microsoft.com/office/word/2010/wordprocessingDrawing" xmlns:wp="http://schemas.openxmlformats.org/drawingml/2006/wordprocessingDrawing" xmlns:w10="urn:schemas-microsoft-com:office:word" xmlns:w="http://schemas.openxmlformats.org/wordprocessingml/2006/main" xmlns:w14="http://schemas.microsoft.com/office/word/2010/wordml" xmlns:w15="http://schemas.microsoft.com/office/word/2012/wordml" xmlns:w16cex="http://schemas.microsoft.com/office/word/2018/wordml/cex" xmlns:w16cid="http://schemas.microsoft.com/office/word/2016/wordml/cid" xmlns:w16="http://schemas.microsoft.com/office/word/2018/wordml" xmlns:w16du="http://schemas.microsoft.com/office/word/2023/wordml/word16du" xmlns:w16sdtdh="http://schemas.microsoft.com/office/word/2020/wordml/sdtdatahash" xmlns:w16sdtfl="http://schemas.microsoft.com/office/word/2024/wordml/sdtformatlock" xmlns:w16se="http://schemas.microsoft.com/office/word/2015/wordml/symex" xmlns:wpg="http://schemas.microsoft.com/office/word/2010/wordprocessingGroup" xmlns:wpi="http://schemas.microsoft.com/office/word/2010/wordprocessingInk" xmlns:wne="http://schemas.microsoft.com/office/word/2006/wordml" xmlns:wps="http://schemas.microsoft.com/office/word/2010/wordprocessingShape" mc:Ignorable="w14 w15 w16se w16cid w16 w16cex w16sdtdh w16sdtfl w16du wp14">
   <w:body>
     <w:p>
       <w:r>
@@ -174,8 +174,6 @@
                                 </w:rPr>
                                 <w:t>Capstone</w:t>
                               </w:r>
-                              <w:bookmarkStart w:id="0" w:name="_GoBack"/>
-                              <w:bookmarkEnd w:id="0"/>
                             </w:p>
                           </w:txbxContent>
                         </wps:txbx>
@@ -674,7 +672,7 @@
       </w:tblGrid>
       <w:tr>
         <w:trPr>
-          <w:trHeight w:val="440"/>
+          <w:cantSplit/>
         </w:trPr>
         <w:tc>
           <w:tcPr>
@@ -700,31 +698,25 @@
         <w:tc>
           <w:tcPr>
             <w:tcW w:w="6622" w:type="dxa"/>
-            <w:vAlign w:val="center"/>
           </w:tcPr>
           <w:p>
             <w:pPr>
-              <w:rPr>
-                <w:b/>
-              </w:rPr>
-            </w:pPr>
-            <w:r>
-              <w:rPr>
-                <w:rFonts w:ascii="Calibri" w:hAnsi="Calibri" w:cs="Arial"/>
-                <w:i/>
-                <w:color w:val="548DD4"/>
-                <w:sz w:val="20"/>
-                <w:szCs w:val="20"/>
-                <w:lang w:eastAsia="es-CL"/>
-              </w:rPr>
-              <w:t>Escribe el nombre de tu Proyecto APT.</w:t>
+              <w:spacing w:after="60" w:line="240" w:lineRule="auto"/>
+            </w:pPr>
+            <w:r>
+              <w:rPr>
+                <w:rFonts w:ascii="Calibri" w:hAnsi="Calibri"/>
+                <w:color w:val="1F3864"/>
+                <w:sz w:val="19"/>
+              </w:rPr>
+              <w:t>ErgoSense</w:t>
             </w:r>
           </w:p>
         </w:tc>
       </w:tr>
       <w:tr>
         <w:trPr>
-          <w:trHeight w:val="418"/>
+          <w:cantSplit/>
         </w:trPr>
         <w:tc>
           <w:tcPr>
@@ -750,53 +742,25 @@
         <w:tc>
           <w:tcPr>
             <w:tcW w:w="6622" w:type="dxa"/>
-            <w:vAlign w:val="center"/>
           </w:tcPr>
           <w:p>
             <w:pPr>
-              <w:rPr>
-                <w:b/>
-              </w:rPr>
-            </w:pPr>
-            <w:r>
-              <w:rPr>
-                <w:rFonts w:ascii="Calibri" w:hAnsi="Calibri" w:cs="Arial"/>
-                <w:i/>
-                <w:color w:val="548DD4"/>
-                <w:sz w:val="20"/>
-                <w:szCs w:val="20"/>
-                <w:lang w:eastAsia="es-CL"/>
-              </w:rPr>
-              <w:t xml:space="preserve">Menciona la(s) área(s) de desempeño de tu Plan de Estudio que </w:t>
-            </w:r>
-            <w:r>
-              <w:rPr>
-                <w:rFonts w:ascii="Calibri" w:hAnsi="Calibri" w:cs="Arial"/>
-                <w:i/>
-                <w:color w:val="548DD4"/>
-                <w:sz w:val="20"/>
-                <w:szCs w:val="20"/>
-                <w:lang w:eastAsia="es-CL"/>
-              </w:rPr>
-              <w:t xml:space="preserve">abordaron </w:t>
-            </w:r>
-            <w:r>
-              <w:rPr>
-                <w:rFonts w:ascii="Calibri" w:hAnsi="Calibri" w:cs="Arial"/>
-                <w:i/>
-                <w:color w:val="548DD4"/>
-                <w:sz w:val="20"/>
-                <w:szCs w:val="20"/>
-                <w:lang w:eastAsia="es-CL"/>
-              </w:rPr>
-              <w:t>tu Proyecto APT.</w:t>
+              <w:spacing w:after="60" w:line="240" w:lineRule="auto"/>
+            </w:pPr>
+            <w:r>
+              <w:rPr>
+                <w:rFonts w:ascii="Calibri" w:hAnsi="Calibri"/>
+                <w:color w:val="1F3864"/>
+                <w:sz w:val="19"/>
+              </w:rPr>
+              <w:t>Desarrollo de Software e Ingeniería de Software, con aplicación de arquitectura, bases de datos, seguridad, pruebas, visión computacional e interacción humano-computador.</w:t>
             </w:r>
           </w:p>
         </w:tc>
       </w:tr>
       <w:tr>
         <w:trPr>
-          <w:trHeight w:val="425"/>
+          <w:cantSplit/>
         </w:trPr>
         <w:tc>
           <w:tcPr>
@@ -830,46 +794,18 @@
         <w:tc>
           <w:tcPr>
             <w:tcW w:w="6622" w:type="dxa"/>
-            <w:vAlign w:val="center"/>
           </w:tcPr>
           <w:p>
             <w:pPr>
-              <w:rPr>
-                <w:b/>
-              </w:rPr>
-            </w:pPr>
-            <w:r>
-              <w:rPr>
-                <w:rFonts w:ascii="Calibri" w:hAnsi="Calibri" w:cs="Arial"/>
-                <w:i/>
-                <w:color w:val="548DD4"/>
-                <w:sz w:val="20"/>
-                <w:szCs w:val="20"/>
-                <w:lang w:eastAsia="es-CL"/>
-              </w:rPr>
-              <w:t xml:space="preserve">Menciona las competencias  de tu Plan de Estudio que </w:t>
-            </w:r>
-            <w:r>
-              <w:rPr>
-                <w:rFonts w:ascii="Calibri" w:hAnsi="Calibri" w:cs="Arial"/>
-                <w:i/>
-                <w:color w:val="548DD4"/>
-                <w:sz w:val="20"/>
-                <w:szCs w:val="20"/>
-                <w:lang w:eastAsia="es-CL"/>
-              </w:rPr>
-              <w:t>abordaste e</w:t>
-            </w:r>
-            <w:r>
-              <w:rPr>
-                <w:rFonts w:ascii="Calibri" w:hAnsi="Calibri" w:cs="Arial"/>
-                <w:i/>
-                <w:color w:val="548DD4"/>
-                <w:sz w:val="20"/>
-                <w:szCs w:val="20"/>
-                <w:lang w:eastAsia="es-CL"/>
-              </w:rPr>
-              <w:t>n tu Proyecto APT.</w:t>
+              <w:spacing w:after="60" w:line="240" w:lineRule="auto"/>
+            </w:pPr>
+            <w:r>
+              <w:rPr>
+                <w:rFonts w:ascii="Calibri" w:hAnsi="Calibri"/>
+                <w:color w:val="1F3864"/>
+                <w:sz w:val="19"/>
+              </w:rPr>
+              <w:t>Gestionar proyectos informáticos; construir modelos de datos escalables; desarrollar, integrar e implantar soluciones de software; y diseñar y aplicar pruebas de validación conforme a buenas prácticas de la industria.</w:t>
             </w:r>
           </w:p>
         </w:tc>
@@ -903,7 +839,7 @@
       </w:tblGrid>
       <w:tr>
         <w:trPr>
-          <w:trHeight w:val="388"/>
+          <w:cantSplit/>
         </w:trPr>
         <w:tc>
           <w:tcPr>
@@ -950,7 +886,7 @@
       </w:tr>
       <w:tr>
         <w:trPr>
-          <w:trHeight w:val="2266"/>
+          <w:cantSplit/>
         </w:trPr>
         <w:tc>
           <w:tcPr>
@@ -987,433 +923,38 @@
         <w:tc>
           <w:tcPr>
             <w:tcW w:w="6780" w:type="dxa"/>
-            <w:vAlign w:val="center"/>
           </w:tcPr>
           <w:p>
             <w:pPr>
-              <w:pStyle w:val="paragraph"/>
-              <w:numPr>
-                <w:ilvl w:val="0"/>
-                <w:numId w:val="6"/>
-              </w:numPr>
-              <w:spacing w:before="0" w:beforeAutospacing="0" w:after="0" w:afterAutospacing="0"/>
-              <w:ind w:left="301" w:hanging="283"/>
-              <w:jc w:val="both"/>
-              <w:textAlignment w:val="baseline"/>
-              <w:rPr>
-                <w:rFonts w:ascii="Segoe UI" w:hAnsi="Segoe UI" w:cs="Segoe UI"/>
-                <w:color w:val="0070C0"/>
-                <w:sz w:val="18"/>
-                <w:szCs w:val="18"/>
-              </w:rPr>
-            </w:pPr>
-            <w:r>
-              <w:rPr>
-                <w:rStyle w:val="normaltextrun"/>
-                <w:rFonts w:ascii="Calibri" w:hAnsi="Calibri" w:cs="Calibri"/>
-                <w:i/>
-                <w:iCs/>
-                <w:color w:val="0070C0"/>
-                <w:sz w:val="18"/>
-                <w:szCs w:val="18"/>
-              </w:rPr>
-              <w:t>Señala qu</w:t>
-            </w:r>
-            <w:r>
-              <w:rPr>
-                <w:rStyle w:val="normaltextrun"/>
-                <w:rFonts w:ascii="Segoe UI" w:hAnsi="Segoe UI" w:cs="Segoe UI"/>
-                <w:i/>
-                <w:iCs/>
-                <w:color w:val="0070C0"/>
-                <w:sz w:val="18"/>
-                <w:szCs w:val="18"/>
-              </w:rPr>
-              <w:t>é</w:t>
-            </w:r>
-            <w:r>
-              <w:rPr>
-                <w:rStyle w:val="normaltextrun"/>
-                <w:rFonts w:ascii="Calibri" w:hAnsi="Calibri" w:cs="Calibri"/>
-                <w:i/>
-                <w:iCs/>
-                <w:color w:val="0070C0"/>
-                <w:sz w:val="18"/>
-                <w:szCs w:val="18"/>
-              </w:rPr>
-              <w:t xml:space="preserve"> problema busc</w:t>
-            </w:r>
-            <w:r>
-              <w:rPr>
-                <w:rStyle w:val="normaltextrun"/>
-                <w:rFonts w:ascii="Calibri" w:hAnsi="Calibri" w:cs="Calibri"/>
-                <w:i/>
-                <w:iCs/>
-                <w:color w:val="0070C0"/>
-                <w:sz w:val="18"/>
-                <w:szCs w:val="18"/>
-              </w:rPr>
-              <w:t>ó</w:t>
-            </w:r>
-            <w:r>
-              <w:rPr>
-                <w:rStyle w:val="normaltextrun"/>
-                <w:rFonts w:ascii="Calibri" w:hAnsi="Calibri" w:cs="Calibri"/>
-                <w:i/>
-                <w:iCs/>
-                <w:color w:val="0070C0"/>
-                <w:sz w:val="18"/>
-                <w:szCs w:val="18"/>
-              </w:rPr>
-              <w:t xml:space="preserve"> solucionar tu proyecto</w:t>
-            </w:r>
-            <w:r>
-              <w:rPr>
-                <w:rStyle w:val="normaltextrun"/>
-                <w:rFonts w:ascii="Calibri" w:hAnsi="Calibri" w:cs="Calibri"/>
-                <w:i/>
-                <w:iCs/>
-                <w:color w:val="0070C0"/>
-                <w:sz w:val="18"/>
-                <w:szCs w:val="18"/>
-              </w:rPr>
-              <w:t xml:space="preserve"> y</w:t>
-            </w:r>
-            <w:r>
-              <w:rPr>
-                <w:rStyle w:val="normaltextrun"/>
-                <w:rFonts w:ascii="Calibri" w:hAnsi="Calibri" w:cs="Calibri"/>
-                <w:i/>
-                <w:iCs/>
-                <w:color w:val="0070C0"/>
-                <w:sz w:val="18"/>
-                <w:szCs w:val="18"/>
-              </w:rPr>
-              <w:t xml:space="preserve"> </w:t>
-            </w:r>
-            <w:r>
-              <w:rPr>
-                <w:rStyle w:val="normaltextrun"/>
-                <w:rFonts w:ascii="Calibri" w:hAnsi="Calibri" w:cs="Calibri"/>
-                <w:i/>
-                <w:iCs/>
-                <w:color w:val="0070C0"/>
-                <w:sz w:val="18"/>
-                <w:szCs w:val="18"/>
-              </w:rPr>
-              <w:t>su</w:t>
-            </w:r>
-            <w:r>
-              <w:rPr>
-                <w:rStyle w:val="normaltextrun"/>
-                <w:rFonts w:ascii="Calibri" w:hAnsi="Calibri" w:cs="Calibri"/>
-                <w:i/>
-                <w:iCs/>
-                <w:color w:val="0070C0"/>
-                <w:sz w:val="18"/>
-                <w:szCs w:val="18"/>
-              </w:rPr>
-              <w:t xml:space="preserve"> relevancia para e</w:t>
-            </w:r>
-            <w:r>
-              <w:rPr>
-                <w:rStyle w:val="normaltextrun"/>
-                <w:rFonts w:ascii="Calibri" w:hAnsi="Calibri" w:cs="Calibri"/>
-                <w:i/>
-                <w:iCs/>
-                <w:color w:val="0070C0"/>
-                <w:sz w:val="18"/>
-                <w:szCs w:val="18"/>
-              </w:rPr>
-              <w:t>l</w:t>
-            </w:r>
-            <w:r>
-              <w:rPr>
-                <w:rStyle w:val="normaltextrun"/>
-                <w:rFonts w:ascii="Calibri" w:hAnsi="Calibri" w:cs="Calibri"/>
-                <w:i/>
-                <w:iCs/>
-                <w:color w:val="0070C0"/>
-                <w:sz w:val="18"/>
-                <w:szCs w:val="18"/>
-              </w:rPr>
-              <w:t xml:space="preserve"> contexto de la profesión</w:t>
-            </w:r>
-            <w:r>
-              <w:rPr>
-                <w:rStyle w:val="normaltextrun"/>
-                <w:rFonts w:ascii="Calibri" w:hAnsi="Calibri" w:cs="Calibri"/>
-                <w:i/>
-                <w:iCs/>
-                <w:color w:val="0070C0"/>
-                <w:sz w:val="18"/>
-                <w:szCs w:val="18"/>
-              </w:rPr>
-              <w:t>. Algunas preguntas que pueden ayudarte a responder este apartado son: </w:t>
-            </w:r>
-            <w:r>
-              <w:rPr>
-                <w:rStyle w:val="eop"/>
-                <w:rFonts w:ascii="Calibri" w:hAnsi="Calibri" w:cs="Calibri"/>
-                <w:color w:val="0070C0"/>
-                <w:sz w:val="18"/>
-                <w:szCs w:val="18"/>
-              </w:rPr>
-              <w:t> </w:t>
-            </w:r>
-          </w:p>
-          <w:p>
-            <w:pPr>
-              <w:pStyle w:val="paragraph"/>
-              <w:numPr>
-                <w:ilvl w:val="0"/>
-                <w:numId w:val="5"/>
-              </w:numPr>
-              <w:spacing w:before="0" w:beforeAutospacing="0" w:after="0" w:afterAutospacing="0"/>
-              <w:jc w:val="both"/>
-              <w:textAlignment w:val="baseline"/>
-              <w:rPr>
-                <w:rFonts w:ascii="Calibri" w:hAnsi="Calibri" w:cs="Calibri"/>
-                <w:color w:val="0070C0"/>
-                <w:sz w:val="18"/>
-                <w:szCs w:val="18"/>
-              </w:rPr>
-            </w:pPr>
-            <w:r>
-              <w:rPr>
-                <w:rStyle w:val="normaltextrun"/>
-                <w:rFonts w:ascii="Calibri" w:hAnsi="Calibri" w:cs="Calibri"/>
-                <w:i/>
-                <w:iCs/>
-                <w:color w:val="0070C0"/>
-                <w:sz w:val="18"/>
-                <w:szCs w:val="18"/>
-              </w:rPr>
-              <w:t>¿Por qué es relevante este tema para el campo laboral de tu carrera?</w:t>
-            </w:r>
-            <w:r>
-              <w:rPr>
-                <w:rStyle w:val="eop"/>
-                <w:rFonts w:ascii="Calibri" w:hAnsi="Calibri" w:cs="Calibri"/>
-                <w:color w:val="0070C0"/>
-                <w:sz w:val="18"/>
-                <w:szCs w:val="18"/>
-              </w:rPr>
-              <w:t> </w:t>
-            </w:r>
-          </w:p>
-          <w:p>
-            <w:pPr>
-              <w:pStyle w:val="paragraph"/>
-              <w:numPr>
-                <w:ilvl w:val="0"/>
-                <w:numId w:val="5"/>
-              </w:numPr>
-              <w:spacing w:before="0" w:beforeAutospacing="0" w:after="0" w:afterAutospacing="0"/>
-              <w:jc w:val="both"/>
-              <w:textAlignment w:val="baseline"/>
-              <w:rPr>
-                <w:rFonts w:ascii="Calibri" w:hAnsi="Calibri" w:cs="Calibri"/>
-                <w:color w:val="0070C0"/>
-                <w:sz w:val="18"/>
-                <w:szCs w:val="18"/>
-              </w:rPr>
-            </w:pPr>
-            <w:r>
-              <w:rPr>
-                <w:rStyle w:val="normaltextrun"/>
-                <w:rFonts w:ascii="Calibri" w:hAnsi="Calibri" w:cs="Calibri"/>
-                <w:i/>
-                <w:iCs/>
-                <w:color w:val="0070C0"/>
-                <w:sz w:val="18"/>
-                <w:szCs w:val="18"/>
-              </w:rPr>
-              <w:t>¿Dónde se ubica la situación que vas a abordar? (Ej.: País, región, comuna o institución) ¿Cuáles son las características principales de ese lugar? </w:t>
-            </w:r>
-            <w:r>
-              <w:rPr>
-                <w:rStyle w:val="eop"/>
-                <w:rFonts w:ascii="Calibri" w:hAnsi="Calibri" w:cs="Calibri"/>
-                <w:color w:val="0070C0"/>
-                <w:sz w:val="18"/>
-                <w:szCs w:val="18"/>
-              </w:rPr>
-              <w:t> </w:t>
-            </w:r>
-          </w:p>
-          <w:p>
-            <w:pPr>
-              <w:pStyle w:val="paragraph"/>
-              <w:numPr>
-                <w:ilvl w:val="0"/>
-                <w:numId w:val="5"/>
-              </w:numPr>
-              <w:spacing w:before="0" w:beforeAutospacing="0" w:after="0" w:afterAutospacing="0"/>
-              <w:jc w:val="both"/>
-              <w:textAlignment w:val="baseline"/>
-              <w:rPr>
-                <w:rFonts w:ascii="Calibri" w:hAnsi="Calibri" w:cs="Calibri"/>
-                <w:color w:val="0070C0"/>
-                <w:sz w:val="18"/>
-                <w:szCs w:val="18"/>
-              </w:rPr>
-            </w:pPr>
-            <w:r>
-              <w:rPr>
-                <w:rStyle w:val="normaltextrun"/>
-                <w:rFonts w:ascii="Calibri" w:hAnsi="Calibri" w:cs="Calibri"/>
-                <w:i/>
-                <w:iCs/>
-                <w:color w:val="0070C0"/>
-                <w:sz w:val="18"/>
-                <w:szCs w:val="18"/>
-              </w:rPr>
-              <w:t xml:space="preserve">¿A quiénes afecta o impacta la situación que </w:t>
-            </w:r>
-            <w:r>
-              <w:rPr>
-                <w:rStyle w:val="normaltextrun"/>
-                <w:rFonts w:ascii="Calibri" w:hAnsi="Calibri" w:cs="Calibri"/>
-                <w:i/>
-                <w:iCs/>
-                <w:color w:val="0070C0"/>
-                <w:sz w:val="18"/>
-                <w:szCs w:val="18"/>
-              </w:rPr>
-              <w:t>abordaste</w:t>
-            </w:r>
-            <w:r>
-              <w:rPr>
-                <w:rStyle w:val="normaltextrun"/>
-                <w:rFonts w:ascii="Calibri" w:hAnsi="Calibri" w:cs="Calibri"/>
-                <w:i/>
-                <w:iCs/>
-                <w:color w:val="0070C0"/>
-                <w:sz w:val="18"/>
-                <w:szCs w:val="18"/>
-              </w:rPr>
-              <w:t>? (Ej.: Grupo etario, usuarios de algún servicio, etc.).</w:t>
-            </w:r>
-            <w:r>
-              <w:rPr>
-                <w:rStyle w:val="eop"/>
-                <w:rFonts w:ascii="Calibri" w:hAnsi="Calibri" w:cs="Calibri"/>
-                <w:color w:val="0070C0"/>
-                <w:sz w:val="18"/>
-                <w:szCs w:val="18"/>
-              </w:rPr>
-              <w:t> </w:t>
-            </w:r>
-          </w:p>
-          <w:p>
-            <w:pPr>
-              <w:pStyle w:val="paragraph"/>
-              <w:numPr>
-                <w:ilvl w:val="0"/>
-                <w:numId w:val="5"/>
-              </w:numPr>
-              <w:spacing w:before="0" w:beforeAutospacing="0" w:after="0" w:afterAutospacing="0"/>
-              <w:jc w:val="both"/>
-              <w:textAlignment w:val="baseline"/>
-              <w:rPr>
-                <w:rFonts w:ascii="Calibri" w:hAnsi="Calibri" w:cs="Calibri"/>
-                <w:color w:val="0070C0"/>
-                <w:sz w:val="18"/>
-                <w:szCs w:val="18"/>
-              </w:rPr>
-            </w:pPr>
-            <w:r>
-              <w:rPr>
-                <w:rStyle w:val="normaltextrun"/>
-                <w:rFonts w:ascii="Calibri" w:hAnsi="Calibri" w:cs="Calibri"/>
-                <w:i/>
-                <w:iCs/>
-                <w:color w:val="0070C0"/>
-                <w:sz w:val="18"/>
-                <w:szCs w:val="18"/>
-              </w:rPr>
-              <w:t xml:space="preserve">¿Cuál </w:t>
-            </w:r>
-            <w:r>
-              <w:rPr>
-                <w:rStyle w:val="normaltextrun"/>
-                <w:rFonts w:ascii="Calibri" w:hAnsi="Calibri" w:cs="Calibri"/>
-                <w:i/>
-                <w:iCs/>
-                <w:color w:val="0070C0"/>
-                <w:sz w:val="18"/>
-                <w:szCs w:val="18"/>
-              </w:rPr>
-              <w:t>fue</w:t>
-            </w:r>
-            <w:r>
-              <w:rPr>
-                <w:rStyle w:val="normaltextrun"/>
-                <w:rFonts w:ascii="Calibri" w:hAnsi="Calibri" w:cs="Calibri"/>
-                <w:i/>
-                <w:iCs/>
-                <w:color w:val="0070C0"/>
-                <w:sz w:val="18"/>
-                <w:szCs w:val="18"/>
-              </w:rPr>
-              <w:t xml:space="preserve"> el aporte de valor (real o simulado) de tu Proyecto APT para el contexto laboral y/o social en que se situ</w:t>
-            </w:r>
-            <w:r>
-              <w:rPr>
-                <w:rStyle w:val="normaltextrun"/>
-                <w:rFonts w:ascii="Calibri" w:hAnsi="Calibri" w:cs="Calibri"/>
-                <w:i/>
-                <w:iCs/>
-                <w:color w:val="0070C0"/>
-                <w:sz w:val="18"/>
-                <w:szCs w:val="18"/>
-              </w:rPr>
-              <w:t>ó</w:t>
-            </w:r>
-            <w:r>
-              <w:rPr>
-                <w:rStyle w:val="normaltextrun"/>
-                <w:rFonts w:ascii="Calibri" w:hAnsi="Calibri" w:cs="Calibri"/>
-                <w:i/>
-                <w:iCs/>
-                <w:color w:val="0070C0"/>
-                <w:sz w:val="18"/>
-                <w:szCs w:val="18"/>
-              </w:rPr>
-              <w:t>?</w:t>
-            </w:r>
-            <w:r>
-              <w:rPr>
-                <w:rStyle w:val="eop"/>
-                <w:rFonts w:ascii="Calibri" w:hAnsi="Calibri" w:cs="Calibri"/>
-                <w:color w:val="0070C0"/>
-                <w:sz w:val="18"/>
-                <w:szCs w:val="18"/>
-              </w:rPr>
-              <w:t> </w:t>
-            </w:r>
-          </w:p>
-          <w:p>
-            <w:pPr>
-              <w:pStyle w:val="Prrafodelista"/>
-              <w:spacing w:after="0" w:line="240" w:lineRule="auto"/>
-              <w:jc w:val="both"/>
-              <w:rPr>
-                <w:rFonts w:ascii="Calibri" w:hAnsi="Calibri" w:cs="Arial"/>
-                <w:i/>
-                <w:color w:val="0070C0"/>
-                <w:sz w:val="18"/>
-                <w:szCs w:val="20"/>
-                <w:lang w:eastAsia="es-CL"/>
-              </w:rPr>
-            </w:pPr>
+              <w:spacing w:after="60" w:line="240" w:lineRule="auto"/>
+            </w:pPr>
+            <w:r>
+              <w:rPr>
+                <w:rFonts w:ascii="Calibri" w:hAnsi="Calibri"/>
+                <w:color w:val="1F3864"/>
+                <w:sz w:val="19"/>
+              </w:rPr>
+              <w:t>ErgoSense aborda el uso prolongado del computador y la dependencia continua del teclado y el mouse durante tareas académicas, administrativas, de desarrollo y teletrabajo. Estos hábitos pueden favorecer períodos extensos sin pausas y la repetición de movimientos. La propuesta se orienta a usuarios de Windows que permanecen varias horas frente al equipo.</w:t>
+            </w:r>
+          </w:p>
+          <w:p>
+            <w:pPr>
+              <w:spacing w:after="60" w:line="240" w:lineRule="auto"/>
+            </w:pPr>
+            <w:r>
+              <w:rPr>
+                <w:rFonts w:ascii="Calibri" w:hAnsi="Calibri"/>
+                <w:color w:val="1F3864"/>
+                <w:sz w:val="19"/>
+              </w:rPr>
+              <w:t>El aporte del proyecto consiste en reunir monitoreo de actividad, recordatorios de pausa y formas alternativas de interacción en una aplicación de escritorio. Hasta el Sprint 03, el sistema registra actividad, recomienda una pausa cada 60 minutos, guarda sesiones y pausas por usuario y permite controlar el cursor mediante gestos. ErgoSense no realiza diagnósticos médicos ni evaluaciones clínicas.</w:t>
+            </w:r>
           </w:p>
         </w:tc>
       </w:tr>
       <w:tr>
         <w:trPr>
-          <w:trHeight w:val="838"/>
+          <w:cantSplit/>
         </w:trPr>
         <w:tc>
           <w:tcPr>
@@ -1434,6 +975,7 @@
                 <w:color w:val="1F3864" w:themeColor="accent1" w:themeShade="80"/>
                 <w:sz w:val="18"/>
               </w:rPr>
+              <w:lastRenderedPageBreak/>
               <w:t xml:space="preserve">2. Objetivos </w:t>
             </w:r>
           </w:p>
@@ -1441,201 +983,122 @@
         <w:tc>
           <w:tcPr>
             <w:tcW w:w="6780" w:type="dxa"/>
-            <w:vAlign w:val="center"/>
           </w:tcPr>
           <w:p>
             <w:pPr>
-              <w:pStyle w:val="Prrafodelista"/>
-              <w:numPr>
-                <w:ilvl w:val="0"/>
-                <w:numId w:val="1"/>
-              </w:numPr>
-              <w:spacing w:after="0" w:line="240" w:lineRule="auto"/>
-              <w:ind w:left="314" w:hanging="284"/>
-              <w:jc w:val="both"/>
-              <w:rPr>
-                <w:rFonts w:ascii="Calibri" w:hAnsi="Calibri" w:cs="Arial"/>
-                <w:i/>
-                <w:color w:val="0070C0"/>
-                <w:sz w:val="18"/>
-                <w:szCs w:val="20"/>
-                <w:lang w:eastAsia="es-CL"/>
-              </w:rPr>
-            </w:pPr>
-            <w:r>
-              <w:rPr>
-                <w:rFonts w:ascii="Calibri" w:hAnsi="Calibri" w:cs="Arial"/>
-                <w:i/>
-                <w:color w:val="0070C0"/>
-                <w:sz w:val="18"/>
-                <w:szCs w:val="20"/>
-                <w:lang w:eastAsia="es-CL"/>
-              </w:rPr>
-              <w:t>Objetivo general y específicos.</w:t>
-            </w:r>
-          </w:p>
-          <w:p>
-            <w:pPr>
-              <w:pStyle w:val="Prrafodelista"/>
-              <w:jc w:val="both"/>
-              <w:rPr>
-                <w:rFonts w:ascii="Calibri" w:hAnsi="Calibri" w:cs="Arial"/>
-                <w:i/>
-                <w:color w:val="0070C0"/>
-                <w:sz w:val="18"/>
-                <w:szCs w:val="20"/>
-                <w:lang w:eastAsia="es-CL"/>
-              </w:rPr>
-            </w:pPr>
-            <w:r>
-              <w:rPr>
-                <w:rFonts w:ascii="Calibri" w:hAnsi="Calibri" w:cs="Arial"/>
-                <w:i/>
-                <w:color w:val="0070C0"/>
-                <w:sz w:val="18"/>
-                <w:szCs w:val="20"/>
-                <w:lang w:eastAsia="es-CL"/>
-              </w:rPr>
-              <w:t>¿Cuál es el objetivo general de tu Proyecto APT? ¿Cuáles son los objetivos específicos de tu Proyecto APT?</w:t>
-            </w:r>
-          </w:p>
-        </w:tc>
-      </w:tr>
-      <w:tr>
-        <w:tc>
-          <w:tcPr>
-            <w:tcW w:w="3001" w:type="dxa"/>
-            <w:vAlign w:val="center"/>
-          </w:tcPr>
-          <w:p>
-            <w:pPr>
-              <w:rPr>
-                <w:rFonts w:ascii="Calibri" w:hAnsi="Calibri"/>
-                <w:color w:val="1F3864" w:themeColor="accent1" w:themeShade="80"/>
-                <w:sz w:val="18"/>
-              </w:rPr>
-            </w:pPr>
-            <w:r>
-              <w:rPr>
-                <w:rFonts w:ascii="Calibri" w:hAnsi="Calibri"/>
-                <w:color w:val="1F3864" w:themeColor="accent1" w:themeShade="80"/>
-                <w:sz w:val="18"/>
-              </w:rPr>
-              <w:t>3. Metodología</w:t>
-            </w:r>
-          </w:p>
-        </w:tc>
-        <w:tc>
-          <w:tcPr>
-            <w:tcW w:w="6780" w:type="dxa"/>
-            <w:vAlign w:val="center"/>
-          </w:tcPr>
-          <w:p>
-            <w:pPr>
-              <w:pStyle w:val="Prrafodelista"/>
-              <w:numPr>
-                <w:ilvl w:val="0"/>
-                <w:numId w:val="1"/>
-              </w:numPr>
-              <w:spacing w:after="0" w:line="240" w:lineRule="auto"/>
-              <w:ind w:left="318" w:hanging="284"/>
-              <w:jc w:val="both"/>
-              <w:rPr>
-                <w:rFonts w:ascii="Calibri" w:hAnsi="Calibri" w:cs="Arial"/>
-                <w:i/>
-                <w:color w:val="0070C0"/>
-                <w:sz w:val="18"/>
-                <w:szCs w:val="20"/>
-                <w:lang w:eastAsia="es-CL"/>
-              </w:rPr>
-            </w:pPr>
-            <w:r>
-              <w:rPr>
-                <w:rFonts w:ascii="Calibri" w:hAnsi="Calibri" w:cs="Arial"/>
-                <w:i/>
-                <w:color w:val="0070C0"/>
-                <w:sz w:val="18"/>
-                <w:szCs w:val="20"/>
-                <w:lang w:eastAsia="es-CL"/>
-              </w:rPr>
-              <w:t>Metodología utilizada y su pertinencia para cumplir objetivos.</w:t>
-            </w:r>
-          </w:p>
-          <w:p>
-            <w:pPr>
-              <w:ind w:left="720"/>
-              <w:rPr>
-                <w:rFonts w:ascii="Calibri" w:hAnsi="Calibri" w:cs="Arial"/>
-                <w:i/>
-                <w:color w:val="0070C0"/>
-                <w:sz w:val="18"/>
-                <w:szCs w:val="20"/>
-                <w:lang w:eastAsia="es-CL"/>
-              </w:rPr>
-            </w:pPr>
-            <w:r>
-              <w:rPr>
-                <w:rFonts w:ascii="Calibri" w:hAnsi="Calibri" w:cs="Arial"/>
-                <w:i/>
-                <w:color w:val="0070C0"/>
-                <w:sz w:val="18"/>
-                <w:szCs w:val="20"/>
-                <w:lang w:eastAsia="es-CL"/>
-              </w:rPr>
-              <w:t>¿Qué metodología utilizaste para desarrollar tu Proyecto APT?</w:t>
-            </w:r>
-            <w:r>
-              <w:rPr>
-                <w:rFonts w:ascii="Calibri" w:hAnsi="Calibri" w:cs="Arial"/>
-                <w:i/>
-                <w:color w:val="0070C0"/>
-                <w:sz w:val="18"/>
-                <w:szCs w:val="20"/>
-                <w:lang w:eastAsia="es-CL"/>
-              </w:rPr>
-              <w:t xml:space="preserve"> Describe las fases y procedimientos que llevaste a cabo para ejecutar tu proyecto.</w:t>
-            </w:r>
-          </w:p>
-          <w:p>
-            <w:pPr>
-              <w:ind w:left="720"/>
-              <w:rPr>
-                <w:rFonts w:ascii="Calibri" w:hAnsi="Calibri" w:cs="Arial"/>
-                <w:i/>
-                <w:color w:val="0070C0"/>
-                <w:sz w:val="18"/>
-                <w:szCs w:val="20"/>
-                <w:lang w:eastAsia="es-CL"/>
-              </w:rPr>
-            </w:pPr>
-            <w:r>
-              <w:rPr>
-                <w:rFonts w:ascii="Calibri" w:hAnsi="Calibri" w:cs="Arial"/>
-                <w:i/>
-                <w:color w:val="0070C0"/>
-                <w:sz w:val="18"/>
-                <w:szCs w:val="20"/>
-                <w:lang w:eastAsia="es-CL"/>
-              </w:rPr>
-              <w:t>Fundamenta, ¿p</w:t>
-            </w:r>
-            <w:r>
-              <w:rPr>
-                <w:rFonts w:ascii="Calibri" w:hAnsi="Calibri" w:cs="Arial"/>
-                <w:i/>
-                <w:color w:val="0070C0"/>
-                <w:sz w:val="18"/>
-                <w:szCs w:val="20"/>
-                <w:lang w:eastAsia="es-CL"/>
-              </w:rPr>
-              <w:t>or qué esta metodología era pertinente para cumplir los objetivos planteados?</w:t>
+              <w:spacing w:after="60" w:line="240" w:lineRule="auto"/>
+            </w:pPr>
+            <w:r>
+              <w:rPr>
+                <w:rFonts w:ascii="Calibri" w:hAnsi="Calibri"/>
+                <w:b/>
+                <w:color w:val="1F3864"/>
+                <w:sz w:val="19"/>
+              </w:rPr>
+              <w:t>Objetivo general</w:t>
+            </w:r>
+          </w:p>
+          <w:p>
+            <w:pPr>
+              <w:spacing w:after="60" w:line="240" w:lineRule="auto"/>
+            </w:pPr>
+            <w:r>
+              <w:rPr>
+                <w:rFonts w:ascii="Calibri" w:hAnsi="Calibri"/>
+                <w:color w:val="1F3864"/>
+                <w:sz w:val="19"/>
+              </w:rPr>
+              <w:t>Desarrollar una aplicación de escritorio que utilice visión computacional y reconocimiento de voz para controlar funciones del computador mediante gestos y comandos, y que monitoree la actividad para generar recordatorios de pausa cada 60 minutos.</w:t>
+            </w:r>
+          </w:p>
+          <w:p>
+            <w:pPr>
+              <w:spacing w:after="60" w:line="240" w:lineRule="auto"/>
+            </w:pPr>
+            <w:r>
+              <w:rPr>
+                <w:rFonts w:ascii="Calibri" w:hAnsi="Calibri"/>
+                <w:b/>
+                <w:color w:val="1F3864"/>
+                <w:sz w:val="19"/>
+              </w:rPr>
+              <w:t>Objetivos específicos cumplidos hasta el Sprint 03</w:t>
+            </w:r>
+          </w:p>
+          <w:p>
+            <w:pPr>
+              <w:spacing w:after="60" w:line="240" w:lineRule="auto"/>
+              <w:ind w:left="200" w:hanging="160"/>
+            </w:pPr>
+            <w:r>
+              <w:rPr>
+                <w:rFonts w:ascii="Calibri" w:hAnsi="Calibri"/>
+                <w:color w:val="1F3864"/>
+                <w:sz w:val="19"/>
+              </w:rPr>
+              <w:t>• Definir y reconocer gestos para mover el cursor, hacer clic, arrastrar y desplazarse.</w:t>
+            </w:r>
+          </w:p>
+          <w:p>
+            <w:pPr>
+              <w:spacing w:after="60" w:line="240" w:lineRule="auto"/>
+              <w:ind w:left="200" w:hanging="160"/>
+            </w:pPr>
+            <w:r>
+              <w:rPr>
+                <w:rFonts w:ascii="Calibri" w:hAnsi="Calibri"/>
+                <w:color w:val="1F3864"/>
+                <w:sz w:val="19"/>
+              </w:rPr>
+              <w:t>• Implementar monitoreo de teclado y mouse, períodos de actividad, avisos y pausas por inactividad.</w:t>
+            </w:r>
+          </w:p>
+          <w:p>
+            <w:pPr>
+              <w:spacing w:after="60" w:line="240" w:lineRule="auto"/>
+              <w:ind w:left="200" w:hanging="160"/>
+            </w:pPr>
+            <w:r>
+              <w:rPr>
+                <w:rFonts w:ascii="Calibri" w:hAnsi="Calibri"/>
+                <w:color w:val="1F3864"/>
+                <w:sz w:val="19"/>
+              </w:rPr>
+              <w:t>• Implementar cuentas, autenticación, configuración y persistencia de sesiones y pausas.</w:t>
+            </w:r>
+          </w:p>
+          <w:p>
+            <w:pPr>
+              <w:spacing w:after="60" w:line="240" w:lineRule="auto"/>
+              <w:ind w:left="200" w:hanging="160"/>
+            </w:pPr>
+            <w:r>
+              <w:rPr>
+                <w:rFonts w:ascii="Calibri" w:hAnsi="Calibri"/>
+                <w:color w:val="1F3864"/>
+                <w:sz w:val="19"/>
+              </w:rPr>
+              <w:t>• Integrar el módulo gestual con la aplicación de escritorio y la configuración del usuario.</w:t>
+            </w:r>
+          </w:p>
+          <w:p>
+            <w:pPr>
+              <w:spacing w:after="60" w:line="240" w:lineRule="auto"/>
+            </w:pPr>
+            <w:r>
+              <w:rPr>
+                <w:rFonts w:ascii="Calibri" w:hAnsi="Calibri"/>
+                <w:color w:val="1F3864"/>
+                <w:sz w:val="19"/>
+              </w:rPr>
+              <w:t>El reconocimiento de voz, las macros, la interfaz completa y la integración final permanecen planificados para los Sprints 04–06.</w:t>
             </w:r>
           </w:p>
         </w:tc>
       </w:tr>
       <w:tr>
         <w:trPr>
-          <w:trHeight w:val="2117"/>
+          <w:cantSplit/>
         </w:trPr>
         <w:tc>
           <w:tcPr>
@@ -1656,290 +1119,45 @@
                 <w:color w:val="1F3864" w:themeColor="accent1" w:themeShade="80"/>
                 <w:sz w:val="18"/>
               </w:rPr>
-              <w:lastRenderedPageBreak/>
-              <w:t>4. Desarrollo</w:t>
+              <w:t>3. Metodología</w:t>
             </w:r>
           </w:p>
         </w:tc>
         <w:tc>
           <w:tcPr>
             <w:tcW w:w="6780" w:type="dxa"/>
-            <w:vAlign w:val="center"/>
           </w:tcPr>
           <w:p>
             <w:pPr>
-              <w:pStyle w:val="Prrafodelista"/>
-              <w:numPr>
-                <w:ilvl w:val="0"/>
-                <w:numId w:val="1"/>
-              </w:numPr>
-              <w:spacing w:after="0" w:line="240" w:lineRule="auto"/>
-              <w:ind w:left="318" w:hanging="284"/>
-              <w:jc w:val="both"/>
-              <w:rPr>
-                <w:rFonts w:ascii="Calibri" w:hAnsi="Calibri" w:cs="Arial"/>
-                <w:i/>
-                <w:color w:val="0070C0"/>
-                <w:sz w:val="18"/>
-                <w:szCs w:val="20"/>
-                <w:lang w:eastAsia="es-CL"/>
-              </w:rPr>
-            </w:pPr>
-            <w:r>
-              <w:rPr>
-                <w:rFonts w:ascii="Calibri" w:hAnsi="Calibri" w:cs="Arial"/>
-                <w:i/>
-                <w:color w:val="0070C0"/>
-                <w:sz w:val="18"/>
-                <w:szCs w:val="20"/>
-                <w:lang w:eastAsia="es-CL"/>
-              </w:rPr>
-              <w:t>Descripción de las etapas o actividades del Proyecto APT.</w:t>
-            </w:r>
-          </w:p>
-          <w:p>
-            <w:pPr>
-              <w:pStyle w:val="Prrafodelista"/>
-              <w:jc w:val="both"/>
-              <w:rPr>
-                <w:rFonts w:ascii="Calibri" w:hAnsi="Calibri" w:cs="Arial"/>
-                <w:i/>
-                <w:color w:val="0070C0"/>
-                <w:sz w:val="18"/>
-                <w:szCs w:val="20"/>
-                <w:lang w:eastAsia="es-CL"/>
-              </w:rPr>
-            </w:pPr>
-            <w:r>
-              <w:rPr>
-                <w:rFonts w:ascii="Calibri" w:hAnsi="Calibri" w:cs="Arial"/>
-                <w:i/>
-                <w:color w:val="0070C0"/>
-                <w:sz w:val="18"/>
-                <w:szCs w:val="20"/>
-                <w:lang w:eastAsia="es-CL"/>
-              </w:rPr>
-              <w:t xml:space="preserve">¿Cuáles fueron las etapas o actividades </w:t>
-            </w:r>
-            <w:r>
-              <w:rPr>
-                <w:rFonts w:ascii="Calibri" w:hAnsi="Calibri" w:cs="Arial"/>
-                <w:i/>
-                <w:color w:val="0070C0"/>
-                <w:sz w:val="18"/>
-                <w:szCs w:val="20"/>
-                <w:lang w:eastAsia="es-CL"/>
-              </w:rPr>
-              <w:t>que desarrollaste en</w:t>
-            </w:r>
-            <w:r>
-              <w:rPr>
-                <w:rFonts w:ascii="Calibri" w:hAnsi="Calibri" w:cs="Arial"/>
-                <w:i/>
-                <w:color w:val="0070C0"/>
-                <w:sz w:val="18"/>
-                <w:szCs w:val="20"/>
-                <w:lang w:eastAsia="es-CL"/>
-              </w:rPr>
-              <w:t xml:space="preserve"> tu Proyecto APT?</w:t>
-            </w:r>
-          </w:p>
-          <w:p>
-            <w:pPr>
-              <w:pStyle w:val="Prrafodelista"/>
-              <w:numPr>
-                <w:ilvl w:val="0"/>
-                <w:numId w:val="1"/>
-              </w:numPr>
-              <w:spacing w:after="0" w:line="240" w:lineRule="auto"/>
-              <w:ind w:left="318" w:hanging="284"/>
-              <w:jc w:val="both"/>
-              <w:rPr>
-                <w:rFonts w:ascii="Calibri" w:hAnsi="Calibri" w:cs="Arial"/>
-                <w:i/>
-                <w:color w:val="0070C0"/>
-                <w:sz w:val="18"/>
-                <w:szCs w:val="20"/>
-                <w:lang w:eastAsia="es-CL"/>
-              </w:rPr>
-            </w:pPr>
-            <w:r>
-              <w:rPr>
-                <w:rFonts w:ascii="Calibri" w:hAnsi="Calibri" w:cs="Arial"/>
-                <w:i/>
-                <w:color w:val="0070C0"/>
-                <w:sz w:val="18"/>
-                <w:szCs w:val="20"/>
-                <w:lang w:eastAsia="es-CL"/>
-              </w:rPr>
-              <w:t>Dificultades y facilitadores en el desarrollo del Proyecto APT</w:t>
-            </w:r>
-            <w:r>
-              <w:rPr>
-                <w:rFonts w:ascii="Calibri" w:hAnsi="Calibri" w:cs="Arial"/>
-                <w:i/>
-                <w:color w:val="0070C0"/>
-                <w:sz w:val="18"/>
-                <w:szCs w:val="20"/>
-                <w:lang w:eastAsia="es-CL"/>
-              </w:rPr>
-              <w:t>.</w:t>
-            </w:r>
-          </w:p>
-          <w:p>
-            <w:pPr>
-              <w:pStyle w:val="Prrafodelista"/>
-              <w:jc w:val="both"/>
-              <w:rPr>
-                <w:rFonts w:ascii="Calibri" w:hAnsi="Calibri" w:cs="Arial"/>
-                <w:i/>
-                <w:color w:val="0070C0"/>
-                <w:sz w:val="18"/>
-                <w:szCs w:val="20"/>
-                <w:lang w:eastAsia="es-CL"/>
-              </w:rPr>
-            </w:pPr>
-            <w:r>
-              <w:rPr>
-                <w:rFonts w:ascii="Calibri" w:hAnsi="Calibri" w:cs="Arial"/>
-                <w:i/>
-                <w:color w:val="0070C0"/>
-                <w:sz w:val="18"/>
-                <w:szCs w:val="20"/>
-                <w:lang w:eastAsia="es-CL"/>
-              </w:rPr>
-              <w:t>¿Qué elementos/aspectos te facilitaron o ayudaron en el desarrollo de tu proyecto APT?</w:t>
-            </w:r>
-          </w:p>
-          <w:p>
-            <w:pPr>
-              <w:pStyle w:val="Prrafodelista"/>
-              <w:jc w:val="both"/>
-              <w:rPr>
-                <w:rFonts w:ascii="Calibri" w:hAnsi="Calibri" w:cs="Arial"/>
-                <w:i/>
-                <w:color w:val="0070C0"/>
-                <w:sz w:val="18"/>
-                <w:szCs w:val="20"/>
-                <w:lang w:eastAsia="es-CL"/>
-              </w:rPr>
-            </w:pPr>
-            <w:r>
-              <w:rPr>
-                <w:rFonts w:ascii="Calibri" w:hAnsi="Calibri" w:cs="Arial"/>
-                <w:i/>
-                <w:color w:val="0070C0"/>
-                <w:sz w:val="18"/>
-                <w:szCs w:val="20"/>
-                <w:lang w:eastAsia="es-CL"/>
-              </w:rPr>
-              <w:t>¿A qué dificultades</w:t>
-            </w:r>
-            <w:r>
-              <w:rPr>
-                <w:rFonts w:ascii="Calibri" w:hAnsi="Calibri" w:cs="Arial"/>
-                <w:i/>
-                <w:color w:val="0070C0"/>
-                <w:sz w:val="18"/>
-                <w:szCs w:val="20"/>
-                <w:lang w:eastAsia="es-CL"/>
-              </w:rPr>
-              <w:t xml:space="preserve"> enfrentaste en el desarrollo de tu Proyecto APT?</w:t>
-            </w:r>
-          </w:p>
-          <w:p>
-            <w:pPr>
-              <w:pStyle w:val="Prrafodelista"/>
-              <w:numPr>
-                <w:ilvl w:val="0"/>
-                <w:numId w:val="1"/>
-              </w:numPr>
-              <w:spacing w:after="0" w:line="240" w:lineRule="auto"/>
-              <w:ind w:left="318" w:hanging="284"/>
-              <w:jc w:val="both"/>
-              <w:rPr>
-                <w:rFonts w:ascii="Calibri" w:hAnsi="Calibri" w:cs="Arial"/>
-                <w:i/>
-                <w:color w:val="0070C0"/>
-                <w:sz w:val="18"/>
-                <w:szCs w:val="20"/>
-                <w:lang w:eastAsia="es-CL"/>
-              </w:rPr>
-            </w:pPr>
-            <w:r>
-              <w:rPr>
-                <w:rFonts w:ascii="Calibri" w:hAnsi="Calibri" w:cs="Arial"/>
-                <w:i/>
-                <w:color w:val="0070C0"/>
-                <w:sz w:val="18"/>
-                <w:szCs w:val="20"/>
-                <w:lang w:eastAsia="es-CL"/>
-              </w:rPr>
-              <w:t>A</w:t>
-            </w:r>
-            <w:r>
-              <w:rPr>
-                <w:rFonts w:ascii="Calibri" w:hAnsi="Calibri" w:cs="Arial"/>
-                <w:i/>
-                <w:color w:val="0070C0"/>
-                <w:sz w:val="18"/>
-                <w:szCs w:val="20"/>
-                <w:lang w:eastAsia="es-CL"/>
-              </w:rPr>
-              <w:t>justes</w:t>
-            </w:r>
-            <w:r>
-              <w:rPr>
-                <w:rFonts w:ascii="Calibri" w:hAnsi="Calibri" w:cs="Arial"/>
-                <w:i/>
-                <w:color w:val="0070C0"/>
-                <w:sz w:val="18"/>
-                <w:szCs w:val="20"/>
-                <w:lang w:eastAsia="es-CL"/>
-              </w:rPr>
-              <w:t xml:space="preserve"> realizados</w:t>
-            </w:r>
-            <w:r>
-              <w:rPr>
-                <w:rFonts w:ascii="Calibri" w:hAnsi="Calibri" w:cs="Arial"/>
-                <w:i/>
-                <w:color w:val="0070C0"/>
-                <w:sz w:val="18"/>
-                <w:szCs w:val="20"/>
-                <w:lang w:eastAsia="es-CL"/>
-              </w:rPr>
-              <w:t>.</w:t>
-            </w:r>
-          </w:p>
-          <w:p>
-            <w:pPr>
-              <w:ind w:left="720"/>
-              <w:rPr>
-                <w:rFonts w:ascii="Calibri" w:hAnsi="Calibri" w:cs="Arial"/>
-                <w:i/>
-                <w:color w:val="0070C0"/>
-                <w:sz w:val="18"/>
-                <w:szCs w:val="20"/>
-                <w:lang w:eastAsia="es-CL"/>
-              </w:rPr>
-            </w:pPr>
-            <w:r>
-              <w:rPr>
-                <w:rFonts w:ascii="Calibri" w:hAnsi="Calibri" w:cs="Arial"/>
-                <w:i/>
-                <w:color w:val="0070C0"/>
-                <w:sz w:val="18"/>
-                <w:szCs w:val="20"/>
-                <w:lang w:eastAsia="es-CL"/>
-              </w:rPr>
-              <w:t xml:space="preserve">¿Cómo abordaste las dificultades para cumplir con los objetivos? ¿Tuviste que hacer algún ajuste? ¿Qué ajuste? </w:t>
+              <w:spacing w:after="60" w:line="240" w:lineRule="auto"/>
+            </w:pPr>
+            <w:r>
+              <w:rPr>
+                <w:rFonts w:ascii="Calibri" w:hAnsi="Calibri"/>
+                <w:color w:val="1F3864"/>
+                <w:sz w:val="19"/>
+              </w:rPr>
+              <w:t>El equipo utilizó Scrum con seis Sprints y desarrollo incremental. Cada incremento partió de elementos priorizados del Product Backlog, se descompuso en tareas y criterios de aceptación y se cerró con integración, pruebas y documentación. El código se organizó en ramas individuales y se integró mediante pull requests revisados por el otro integrante.</w:t>
+            </w:r>
+          </w:p>
+          <w:p>
+            <w:pPr>
+              <w:spacing w:after="60" w:line="240" w:lineRule="auto"/>
+            </w:pPr>
+            <w:r>
+              <w:rPr>
+                <w:rFonts w:ascii="Calibri" w:hAnsi="Calibri"/>
+                <w:color w:val="1F3864"/>
+                <w:sz w:val="19"/>
+              </w:rPr>
+              <w:t>La metodología fue pertinente porque permitió validar primero el monitoreo, luego la infraestructura de cuentas y persistencia y, sobre esa base, el control mediante gestos y la configuración. La arquitectura modular permitió probar la lógica con componentes simulados y reducir la dependencia del hardware durante las pruebas automatizadas.</w:t>
             </w:r>
           </w:p>
         </w:tc>
       </w:tr>
       <w:tr>
         <w:trPr>
-          <w:trHeight w:val="1112"/>
+          <w:cantSplit/>
         </w:trPr>
         <w:tc>
           <w:tcPr>
@@ -1960,110 +1178,202 @@
                 <w:color w:val="1F3864" w:themeColor="accent1" w:themeShade="80"/>
                 <w:sz w:val="18"/>
               </w:rPr>
-              <w:t>5. Evidencias</w:t>
+              <w:t>4. Desarrollo</w:t>
             </w:r>
           </w:p>
         </w:tc>
         <w:tc>
           <w:tcPr>
             <w:tcW w:w="6780" w:type="dxa"/>
+          </w:tcPr>
+          <w:p>
+            <w:pPr>
+              <w:spacing w:after="60" w:line="240" w:lineRule="auto"/>
+            </w:pPr>
+            <w:r>
+              <w:rPr>
+                <w:rFonts w:ascii="Calibri" w:hAnsi="Calibri"/>
+                <w:b/>
+                <w:color w:val="1F3864"/>
+                <w:sz w:val="19"/>
+              </w:rPr>
+              <w:t>Etapas desarrolladas</w:t>
+            </w:r>
+          </w:p>
+          <w:p>
+            <w:pPr>
+              <w:spacing w:after="60" w:line="240" w:lineRule="auto"/>
+              <w:ind w:left="200" w:hanging="160"/>
+            </w:pPr>
+            <w:r>
+              <w:rPr>
+                <w:rFonts w:ascii="Calibri" w:hAnsi="Calibri"/>
+                <w:color w:val="1F3864"/>
+                <w:sz w:val="19"/>
+              </w:rPr>
+              <w:t>• Sprint 01: monitoreo de teclado y mouse, contador de actividad, aviso a los 60 minutos y reinicio del período.</w:t>
+            </w:r>
+          </w:p>
+          <w:p>
+            <w:pPr>
+              <w:spacing w:after="60" w:line="240" w:lineRule="auto"/>
+              <w:ind w:left="200" w:hanging="160"/>
+            </w:pPr>
+            <w:r>
+              <w:rPr>
+                <w:rFonts w:ascii="Calibri" w:hAnsi="Calibri"/>
+                <w:color w:val="1F3864"/>
+                <w:sz w:val="19"/>
+              </w:rPr>
+              <w:t>• Sprint 02: servidor FastAPI, PostgreSQL, autenticación, configuración, sesiones de uso y pausas persistentes.</w:t>
+            </w:r>
+          </w:p>
+          <w:p>
+            <w:pPr>
+              <w:spacing w:after="60" w:line="240" w:lineRule="auto"/>
+              <w:ind w:left="200" w:hanging="160"/>
+            </w:pPr>
+            <w:r>
+              <w:rPr>
+                <w:rFonts w:ascii="Calibri" w:hAnsi="Calibri"/>
+                <w:color w:val="1F3864"/>
+                <w:sz w:val="19"/>
+              </w:rPr>
+              <w:t>• Sprint 03: cámara, seguimiento de mano, clasificación de gestos, cursor, clic, arrastre, scroll y configuración persistente.</w:t>
+            </w:r>
+          </w:p>
+          <w:p>
+            <w:pPr>
+              <w:spacing w:after="60" w:line="240" w:lineRule="auto"/>
+            </w:pPr>
+            <w:r>
+              <w:rPr>
+                <w:rFonts w:ascii="Calibri" w:hAnsi="Calibri"/>
+                <w:b/>
+                <w:color w:val="1F3864"/>
+                <w:sz w:val="19"/>
+              </w:rPr>
+              <w:t>Facilitadores y dificultades</w:t>
+            </w:r>
+          </w:p>
+          <w:p>
+            <w:pPr>
+              <w:spacing w:after="60" w:line="240" w:lineRule="auto"/>
+            </w:pPr>
+            <w:r>
+              <w:rPr>
+                <w:rFonts w:ascii="Calibri" w:hAnsi="Calibri"/>
+                <w:color w:val="1F3864"/>
+                <w:sz w:val="19"/>
+              </w:rPr>
+              <w:t>La comunicación del equipo se mantuvo fluida, con responsabilidades claras y revisión mutua de cambios. No se produjeron problemas de coordinación. Los principales desafíos fueron técnicos: ajustar los umbrales de los gestos, evitar repeticiones involuntarias y coordinar hilos de cámara, acciones e interfaz.</w:t>
+            </w:r>
+          </w:p>
+          <w:p>
+            <w:pPr>
+              <w:spacing w:after="60" w:line="240" w:lineRule="auto"/>
+            </w:pPr>
+            <w:r>
+              <w:rPr>
+                <w:rFonts w:ascii="Calibri" w:hAnsi="Calibri"/>
+                <w:b/>
+                <w:color w:val="1F3864"/>
+                <w:sz w:val="19"/>
+              </w:rPr>
+              <w:t>Ajustes realizados</w:t>
+            </w:r>
+          </w:p>
+          <w:p>
+            <w:pPr>
+              <w:spacing w:after="60" w:line="240" w:lineRule="auto"/>
+            </w:pPr>
+            <w:r>
+              <w:rPr>
+                <w:rFonts w:ascii="Calibri" w:hAnsi="Calibri"/>
+                <w:color w:val="1F3864"/>
+                <w:sz w:val="19"/>
+              </w:rPr>
+              <w:t>Se calibraron los gestos con uso real, se cambió el clic izquierdo al gesto de pulgar doblado, se agregaron tiempos mínimos de confirmación y se incorporaron herramientas de medición. Estos ajustes mantuvieron el alcance y mejoraron la estabilidad.</w:t>
+            </w:r>
+          </w:p>
+        </w:tc>
+      </w:tr>
+    </w:tbl>
+    <w:p>
+      <w:r>
+        <w:br w:type="page"/>
+      </w:r>
+    </w:p>
+    <w:tbl>
+      <w:tblPr>
+        <w:tblStyle w:val="Tablaconcuadrcula"/>
+        <w:tblW w:w="9781" w:type="dxa"/>
+        <w:tblInd w:w="-572" w:type="dxa"/>
+        <w:tblBorders>
+          <w:top w:val="single" w:sz="4" w:space="0" w:color="BFBFBF" w:themeColor="background1" w:themeShade="BF"/>
+          <w:left w:val="single" w:sz="4" w:space="0" w:color="BFBFBF" w:themeColor="background1" w:themeShade="BF"/>
+          <w:bottom w:val="single" w:sz="4" w:space="0" w:color="BFBFBF" w:themeColor="background1" w:themeShade="BF"/>
+          <w:right w:val="single" w:sz="4" w:space="0" w:color="BFBFBF" w:themeColor="background1" w:themeShade="BF"/>
+          <w:insideH w:val="single" w:sz="4" w:space="0" w:color="BFBFBF" w:themeColor="background1" w:themeShade="BF"/>
+          <w:insideV w:val="single" w:sz="4" w:space="0" w:color="BFBFBF" w:themeColor="background1" w:themeShade="BF"/>
+        </w:tblBorders>
+        <w:tblLook w:val="04A0" w:firstRow="1" w:lastRow="0" w:firstColumn="1" w:lastColumn="0" w:noHBand="0" w:noVBand="1"/>
+      </w:tblPr>
+      <w:tblGrid>
+        <w:gridCol w:w="3001"/>
+        <w:gridCol w:w="6780"/>
+      </w:tblGrid>
+      <w:tr>
+        <w:trPr>
+          <w:cantSplit/>
+        </w:trPr>
+        <w:tc>
+          <w:tcPr>
+            <w:tcW w:w="9781" w:type="dxa"/>
+            <w:gridSpan w:val="2"/>
+            <w:shd w:val="clear" w:color="auto" w:fill="D9D9D9" w:themeFill="background1" w:themeFillShade="D9"/>
             <w:vAlign w:val="center"/>
           </w:tcPr>
           <w:p>
             <w:pPr>
-              <w:pStyle w:val="Prrafodelista"/>
-              <w:numPr>
-                <w:ilvl w:val="0"/>
-                <w:numId w:val="1"/>
-              </w:numPr>
-              <w:spacing w:after="0" w:line="240" w:lineRule="auto"/>
-              <w:ind w:left="314" w:hanging="284"/>
-              <w:jc w:val="both"/>
-              <w:rPr>
-                <w:rFonts w:ascii="Calibri" w:hAnsi="Calibri" w:cs="Arial"/>
-                <w:i/>
-                <w:iCs/>
-                <w:color w:val="0070C0"/>
+              <w:rPr>
+                <w:b/>
+              </w:rPr>
+            </w:pPr>
+            <w:r>
+              <w:rPr>
+                <w:rFonts w:ascii="Calibri" w:hAnsi="Calibri"/>
+                <w:b/>
+                <w:color w:val="1F3864" w:themeColor="accent1" w:themeShade="80"/>
                 <w:sz w:val="18"/>
-                <w:szCs w:val="20"/>
-                <w:lang w:eastAsia="es-CL"/>
-              </w:rPr>
-            </w:pPr>
-            <w:r>
-              <w:rPr>
-                <w:rFonts w:ascii="Calibri" w:hAnsi="Calibri" w:cs="Arial"/>
-                <w:i/>
-                <w:iCs/>
-                <w:color w:val="0070C0"/>
+              </w:rPr>
+              <w:lastRenderedPageBreak/>
+              <w:t>Contenidos de</w:t>
+            </w:r>
+            <w:r>
+              <w:rPr>
+                <w:rFonts w:ascii="Calibri" w:hAnsi="Calibri"/>
+                <w:b/>
+                <w:color w:val="1F3864" w:themeColor="accent1" w:themeShade="80"/>
                 <w:sz w:val="18"/>
-                <w:szCs w:val="20"/>
-                <w:lang w:eastAsia="es-CL"/>
-              </w:rPr>
-              <w:t>Adjunta</w:t>
-            </w:r>
-            <w:r>
-              <w:rPr>
-                <w:rFonts w:ascii="Calibri" w:hAnsi="Calibri" w:cs="Arial"/>
-                <w:i/>
-                <w:iCs/>
-                <w:color w:val="0070C0"/>
+              </w:rPr>
+              <w:t>l informe f</w:t>
+            </w:r>
+            <w:r>
+              <w:rPr>
+                <w:rFonts w:ascii="Calibri" w:hAnsi="Calibri"/>
+                <w:b/>
+                <w:color w:val="1F3864" w:themeColor="accent1" w:themeShade="80"/>
                 <w:sz w:val="18"/>
-                <w:szCs w:val="20"/>
-                <w:lang w:eastAsia="es-CL"/>
-              </w:rPr>
-              <w:t xml:space="preserve"> </w:t>
-            </w:r>
-            <w:r>
-              <w:rPr>
-                <w:rFonts w:ascii="Calibri" w:hAnsi="Calibri" w:cs="Arial"/>
-                <w:i/>
-                <w:iCs/>
-                <w:color w:val="0070C0"/>
-                <w:sz w:val="18"/>
-                <w:szCs w:val="20"/>
-                <w:lang w:eastAsia="es-CL"/>
-              </w:rPr>
-              <w:t>evidencias que permitan dar cuenta del desarrollo del Proyecto APT y sus resultados finales.</w:t>
-            </w:r>
-          </w:p>
-          <w:p>
-            <w:pPr>
-              <w:ind w:left="743"/>
-              <w:rPr>
-                <w:b/>
-                <w:i/>
-                <w:color w:val="0070C0"/>
-                <w:sz w:val="18"/>
-              </w:rPr>
-            </w:pPr>
-            <w:r>
-              <w:rPr>
-                <w:rFonts w:ascii="Calibri" w:hAnsi="Calibri" w:cs="Arial"/>
-                <w:i/>
-                <w:color w:val="0070C0"/>
-                <w:sz w:val="18"/>
-                <w:szCs w:val="20"/>
-                <w:lang w:eastAsia="es-CL"/>
-              </w:rPr>
-              <w:t>¿Qué evidencias pueden servir para que los demás puedan visualizar y entender las distintas etapas de tu Proyecto APT y el resultado final?</w:t>
-            </w:r>
-            <w:r>
-              <w:rPr>
-                <w:rFonts w:ascii="Calibri" w:hAnsi="Calibri" w:cs="Arial"/>
-                <w:i/>
-                <w:color w:val="0070C0"/>
-                <w:sz w:val="18"/>
-                <w:szCs w:val="20"/>
-                <w:lang w:eastAsia="es-CL"/>
-              </w:rPr>
-              <w:t xml:space="preserve"> </w:t>
+              </w:rPr>
+              <w:t>inal</w:t>
             </w:r>
           </w:p>
         </w:tc>
       </w:tr>
       <w:tr>
         <w:trPr>
-          <w:trHeight w:val="2547"/>
+          <w:cantSplit/>
         </w:trPr>
         <w:tc>
           <w:tcPr>
@@ -2076,7 +1386,6 @@
                 <w:rFonts w:ascii="Calibri" w:hAnsi="Calibri"/>
                 <w:color w:val="1F3864" w:themeColor="accent1" w:themeShade="80"/>
                 <w:sz w:val="18"/>
-                <w:szCs w:val="18"/>
               </w:rPr>
             </w:pPr>
             <w:r>
@@ -2084,216 +1393,209 @@
                 <w:rFonts w:ascii="Calibri" w:hAnsi="Calibri"/>
                 <w:color w:val="1F3864" w:themeColor="accent1" w:themeShade="80"/>
                 <w:sz w:val="18"/>
-                <w:szCs w:val="18"/>
-              </w:rPr>
-              <w:t>6</w:t>
-            </w:r>
-            <w:r>
-              <w:rPr>
-                <w:rFonts w:ascii="Calibri" w:hAnsi="Calibri"/>
-                <w:color w:val="1F3864" w:themeColor="accent1" w:themeShade="80"/>
-                <w:sz w:val="18"/>
-                <w:szCs w:val="18"/>
-              </w:rPr>
-              <w:t xml:space="preserve">. </w:t>
-            </w:r>
-            <w:r>
-              <w:rPr>
-                <w:rFonts w:ascii="Calibri" w:hAnsi="Calibri"/>
-                <w:color w:val="1F3864" w:themeColor="accent1" w:themeShade="80"/>
-                <w:sz w:val="18"/>
-                <w:szCs w:val="18"/>
-              </w:rPr>
-              <w:t xml:space="preserve">Intereses </w:t>
-            </w:r>
-            <w:r>
-              <w:rPr>
-                <w:rFonts w:ascii="Calibri" w:hAnsi="Calibri"/>
-                <w:color w:val="1F3864" w:themeColor="accent1" w:themeShade="80"/>
-                <w:sz w:val="18"/>
-                <w:szCs w:val="18"/>
-              </w:rPr>
-              <w:t>y proyecciones</w:t>
-            </w:r>
-            <w:r>
-              <w:rPr>
-                <w:rFonts w:ascii="Calibri" w:hAnsi="Calibri"/>
-                <w:color w:val="1F3864" w:themeColor="accent1" w:themeShade="80"/>
-                <w:sz w:val="18"/>
-                <w:szCs w:val="18"/>
-              </w:rPr>
-              <w:t xml:space="preserve"> profesionales</w:t>
+              </w:rPr>
+              <w:t>5. Evidencias</w:t>
             </w:r>
           </w:p>
         </w:tc>
         <w:tc>
           <w:tcPr>
             <w:tcW w:w="6780" w:type="dxa"/>
+          </w:tcPr>
+          <w:p>
+            <w:pPr>
+              <w:spacing w:after="60" w:line="240" w:lineRule="auto"/>
+            </w:pPr>
+            <w:r>
+              <w:rPr>
+                <w:rFonts w:ascii="Calibri" w:hAnsi="Calibri"/>
+                <w:b/>
+                <w:color w:val="1F3864"/>
+                <w:sz w:val="19"/>
+              </w:rPr>
+              <w:t>Evidencias del desarrollo y los resultados hasta el Sprint 03</w:t>
+            </w:r>
+          </w:p>
+          <w:p>
+            <w:pPr>
+              <w:spacing w:after="60" w:line="240" w:lineRule="auto"/>
+              <w:ind w:left="200" w:hanging="160"/>
+            </w:pPr>
+            <w:r>
+              <w:rPr>
+                <w:rFonts w:ascii="Calibri" w:hAnsi="Calibri"/>
+                <w:color w:val="1F3864"/>
+                <w:sz w:val="19"/>
+              </w:rPr>
+              <w:t>• Código fuente del servidor y de la aplicación de escritorio, con historial de cambios y pull requests.</w:t>
+            </w:r>
+          </w:p>
+          <w:p>
+            <w:pPr>
+              <w:spacing w:after="60" w:line="240" w:lineRule="auto"/>
+              <w:ind w:left="200" w:hanging="160"/>
+            </w:pPr>
+            <w:r>
+              <w:rPr>
+                <w:rFonts w:ascii="Calibri" w:hAnsi="Calibri"/>
+                <w:color w:val="1F3864"/>
+                <w:sz w:val="19"/>
+              </w:rPr>
+              <w:t>• Sprint Backlogs 01, 02 y 03, Product Backlog, arquitectura, requisitos no funcionales, Definition of Done y plan de pruebas.</w:t>
+            </w:r>
+          </w:p>
+          <w:p>
+            <w:pPr>
+              <w:spacing w:after="60" w:line="240" w:lineRule="auto"/>
+              <w:ind w:left="200" w:hanging="160"/>
+            </w:pPr>
+            <w:r>
+              <w:rPr>
+                <w:rFonts w:ascii="Calibri" w:hAnsi="Calibri"/>
+                <w:color w:val="1F3864"/>
+                <w:sz w:val="19"/>
+              </w:rPr>
+              <w:t>• API documentada con OpenAPI, migraciones de base de datos, Docker Compose y guías de ejecución.</w:t>
+            </w:r>
+          </w:p>
+          <w:p>
+            <w:pPr>
+              <w:spacing w:after="60" w:line="240" w:lineRule="auto"/>
+              <w:ind w:left="200" w:hanging="160"/>
+            </w:pPr>
+            <w:r>
+              <w:rPr>
+                <w:rFonts w:ascii="Calibri" w:hAnsi="Calibri"/>
+                <w:color w:val="1F3864"/>
+                <w:sz w:val="19"/>
+              </w:rPr>
+              <w:t>• Pruebas automatizadas y scripts manuales para monitoreo, cuentas, sesiones, configuración, cámara, gestos y acciones del mouse.</w:t>
+            </w:r>
+          </w:p>
+          <w:p>
+            <w:pPr>
+              <w:spacing w:after="60" w:line="240" w:lineRule="auto"/>
+            </w:pPr>
+            <w:r>
+              <w:rPr>
+                <w:rFonts w:ascii="Calibri" w:hAnsi="Calibri"/>
+                <w:color w:val="1F3864"/>
+                <w:sz w:val="19"/>
+              </w:rPr>
+              <w:t>Estas evidencias permiten revisar la trazabilidad entre requerimientos, tareas, implementación y validación. El producto verificable corresponde al estado alcanzado al cierre del Sprint 03.</w:t>
+            </w:r>
+          </w:p>
+        </w:tc>
+      </w:tr>
+      <w:tr>
+        <w:trPr>
+          <w:cantSplit/>
+        </w:trPr>
+        <w:tc>
+          <w:tcPr>
+            <w:tcW w:w="3001" w:type="dxa"/>
             <w:vAlign w:val="center"/>
           </w:tcPr>
           <w:p>
             <w:pPr>
-              <w:pStyle w:val="Prrafodelista"/>
-              <w:numPr>
-                <w:ilvl w:val="0"/>
-                <w:numId w:val="1"/>
-              </w:numPr>
-              <w:spacing w:after="0" w:line="240" w:lineRule="auto"/>
-              <w:ind w:left="314" w:hanging="284"/>
-              <w:jc w:val="both"/>
-              <w:rPr>
-                <w:rFonts w:ascii="Calibri" w:hAnsi="Calibri" w:cs="Arial"/>
-                <w:i/>
-                <w:iCs/>
-                <w:color w:val="0070C0"/>
+              <w:rPr>
+                <w:rFonts w:ascii="Calibri" w:hAnsi="Calibri"/>
+                <w:color w:val="1F3864" w:themeColor="accent1" w:themeShade="80"/>
                 <w:sz w:val="18"/>
                 <w:szCs w:val="18"/>
-                <w:lang w:eastAsia="es-CL"/>
-              </w:rPr>
-            </w:pPr>
-            <w:r>
-              <w:rPr>
-                <w:rFonts w:ascii="Calibri" w:hAnsi="Calibri" w:cs="Arial"/>
-                <w:i/>
-                <w:iCs/>
-                <w:color w:val="0070C0"/>
+              </w:rPr>
+            </w:pPr>
+            <w:r>
+              <w:rPr>
+                <w:rFonts w:ascii="Calibri" w:hAnsi="Calibri"/>
+                <w:color w:val="1F3864" w:themeColor="accent1" w:themeShade="80"/>
                 <w:sz w:val="18"/>
                 <w:szCs w:val="18"/>
-                <w:lang w:eastAsia="es-CL"/>
-              </w:rPr>
-              <w:t xml:space="preserve">Reflexión sobre el aporte del Proyecto APT en el </w:t>
-            </w:r>
-            <w:r>
-              <w:rPr>
-                <w:rFonts w:ascii="Calibri" w:hAnsi="Calibri" w:cs="Arial"/>
-                <w:i/>
-                <w:iCs/>
-                <w:color w:val="0070C0"/>
+              </w:rPr>
+              <w:t>6</w:t>
+            </w:r>
+            <w:r>
+              <w:rPr>
+                <w:rFonts w:ascii="Calibri" w:hAnsi="Calibri"/>
+                <w:color w:val="1F3864" w:themeColor="accent1" w:themeShade="80"/>
                 <w:sz w:val="18"/>
                 <w:szCs w:val="18"/>
-                <w:lang w:eastAsia="es-CL"/>
-              </w:rPr>
-              <w:t xml:space="preserve">desarrollo </w:t>
-            </w:r>
-            <w:r>
-              <w:rPr>
-                <w:rFonts w:ascii="Calibri" w:hAnsi="Calibri" w:cs="Arial"/>
-                <w:i/>
-                <w:iCs/>
-                <w:color w:val="0070C0"/>
+              </w:rPr>
+              <w:t xml:space="preserve">. </w:t>
+            </w:r>
+            <w:r>
+              <w:rPr>
+                <w:rFonts w:ascii="Calibri" w:hAnsi="Calibri"/>
+                <w:color w:val="1F3864" w:themeColor="accent1" w:themeShade="80"/>
                 <w:sz w:val="18"/>
                 <w:szCs w:val="18"/>
-                <w:lang w:eastAsia="es-CL"/>
-              </w:rPr>
-              <w:t>de los intereses profesionales.</w:t>
-            </w:r>
-          </w:p>
-          <w:p>
-            <w:pPr>
-              <w:pStyle w:val="Prrafodelista"/>
-              <w:jc w:val="both"/>
-              <w:rPr>
-                <w:rFonts w:ascii="Calibri" w:hAnsi="Calibri" w:cs="Arial"/>
-                <w:i/>
-                <w:color w:val="0070C0"/>
+              </w:rPr>
+              <w:t xml:space="preserve">Intereses </w:t>
+            </w:r>
+            <w:r>
+              <w:rPr>
+                <w:rFonts w:ascii="Calibri" w:hAnsi="Calibri"/>
+                <w:color w:val="1F3864" w:themeColor="accent1" w:themeShade="80"/>
                 <w:sz w:val="18"/>
-                <w:szCs w:val="20"/>
-                <w:lang w:eastAsia="es-CL"/>
-              </w:rPr>
-            </w:pPr>
-            <w:r>
-              <w:rPr>
-                <w:rFonts w:ascii="Calibri" w:hAnsi="Calibri" w:cs="Arial"/>
-                <w:i/>
-                <w:color w:val="0070C0"/>
+                <w:szCs w:val="18"/>
+              </w:rPr>
+              <w:t>y proyecciones</w:t>
+            </w:r>
+            <w:r>
+              <w:rPr>
+                <w:rFonts w:ascii="Calibri" w:hAnsi="Calibri"/>
+                <w:color w:val="1F3864" w:themeColor="accent1" w:themeShade="80"/>
                 <w:sz w:val="18"/>
-                <w:szCs w:val="20"/>
-                <w:lang w:eastAsia="es-CL"/>
-              </w:rPr>
-              <w:t>¿De qué manera tu Proyecto APT te sirvió para tener mayor conocimiento de tus intereses profesionales? Luego de terminar tu Proyecto APT, ¿tus intereses profesionales siguen siendo los mismos que planteaste al comienzo de la asignatura?</w:t>
-            </w:r>
-          </w:p>
-          <w:p>
-            <w:pPr>
-              <w:pStyle w:val="Prrafodelista"/>
-              <w:numPr>
-                <w:ilvl w:val="0"/>
-                <w:numId w:val="1"/>
-              </w:numPr>
-              <w:spacing w:after="0" w:line="240" w:lineRule="auto"/>
-              <w:ind w:left="314" w:hanging="284"/>
-              <w:jc w:val="both"/>
-              <w:rPr>
-                <w:rFonts w:ascii="Calibri" w:hAnsi="Calibri" w:cs="Arial"/>
-                <w:i/>
-                <w:iCs/>
-                <w:color w:val="0070C0"/>
-                <w:sz w:val="18"/>
-                <w:szCs w:val="20"/>
-                <w:lang w:eastAsia="es-CL"/>
-              </w:rPr>
-            </w:pPr>
-            <w:r>
-              <w:rPr>
-                <w:rFonts w:ascii="Calibri" w:hAnsi="Calibri" w:cs="Arial"/>
-                <w:i/>
-                <w:iCs/>
-                <w:color w:val="0070C0"/>
-                <w:sz w:val="18"/>
-                <w:szCs w:val="20"/>
-                <w:lang w:eastAsia="es-CL"/>
-              </w:rPr>
-              <w:t>Proyecciones laborales a partir de Proyecto APT.</w:t>
-            </w:r>
-          </w:p>
-          <w:p>
-            <w:pPr>
-              <w:pStyle w:val="Prrafodelista"/>
-              <w:jc w:val="both"/>
-              <w:rPr>
-                <w:rFonts w:ascii="Calibri" w:hAnsi="Calibri" w:cs="Arial"/>
-                <w:i/>
-                <w:color w:val="0070C0"/>
-                <w:sz w:val="18"/>
-                <w:szCs w:val="20"/>
-                <w:lang w:eastAsia="es-CL"/>
-              </w:rPr>
-            </w:pPr>
-            <w:r>
-              <w:rPr>
-                <w:rFonts w:ascii="Calibri" w:hAnsi="Calibri" w:cs="Arial"/>
-                <w:i/>
-                <w:color w:val="0070C0"/>
-                <w:sz w:val="18"/>
-                <w:szCs w:val="20"/>
-                <w:lang w:eastAsia="es-CL"/>
-              </w:rPr>
-              <w:t>¿Qué intereses profesionales te gustaría explorar o seguir profundizando?</w:t>
-            </w:r>
-          </w:p>
-          <w:p>
-            <w:pPr>
-              <w:pStyle w:val="Prrafodelista"/>
-              <w:jc w:val="both"/>
-              <w:rPr>
-                <w:rFonts w:ascii="Calibri" w:hAnsi="Calibri" w:cs="Arial"/>
-                <w:i/>
-                <w:color w:val="0070C0"/>
-                <w:sz w:val="18"/>
-                <w:szCs w:val="20"/>
-                <w:lang w:eastAsia="es-CL"/>
-              </w:rPr>
-            </w:pPr>
-            <w:r>
-              <w:rPr>
-                <w:rFonts w:ascii="Calibri" w:hAnsi="Calibri" w:cs="Arial"/>
-                <w:i/>
-                <w:color w:val="0070C0"/>
-                <w:sz w:val="18"/>
-                <w:szCs w:val="20"/>
-                <w:lang w:eastAsia="es-CL"/>
-              </w:rPr>
-              <w:t xml:space="preserve">¿Cómo te proyectas laboralmente después de haber terminado tu Proyecto APT? </w:t>
+                <w:szCs w:val="18"/>
+              </w:rPr>
+              <w:t xml:space="preserve"> profesionales</w:t>
+            </w:r>
+          </w:p>
+        </w:tc>
+        <w:tc>
+          <w:tcPr>
+            <w:tcW w:w="6780" w:type="dxa"/>
+          </w:tcPr>
+          <w:p>
+            <w:pPr>
+              <w:spacing w:after="60" w:line="240" w:lineRule="auto"/>
+            </w:pPr>
+            <w:r>
+              <w:rPr>
+                <w:rFonts w:ascii="Calibri" w:hAnsi="Calibri"/>
+                <w:color w:val="1F3864"/>
+                <w:sz w:val="19"/>
+              </w:rPr>
+              <w:t>El proyecto confirmó nuestro interés por el desarrollo de software, la arquitectura, la automatización, la seguridad y la interacción humano-computador. La implementación de visión computacional permitió conocer de forma práctica el procesamiento en tiempo real, la calibración de gestos y la integración con el sistema operativo.</w:t>
+            </w:r>
+          </w:p>
+          <w:p>
+            <w:pPr>
+              <w:spacing w:after="60" w:line="240" w:lineRule="auto"/>
+            </w:pPr>
+            <w:r>
+              <w:rPr>
+                <w:rFonts w:ascii="Calibri" w:hAnsi="Calibri"/>
+                <w:color w:val="1F3864"/>
+                <w:sz w:val="19"/>
+              </w:rPr>
+              <w:t xml:space="preserve">Nuestros intereses se mantienen y se ampliaron hacia el diseño de sistemas modulares y la validación de soluciones que combinan software de escritorio, servicios web y dispositivos. A futuro nos interesa profundizar en desarrollo backend, aplicaciones de escritorio, </w:t>
+            </w:r>
+            <w:r>
+              <w:rPr>
+                <w:rFonts w:ascii="Calibri" w:hAnsi="Calibri"/>
+                <w:color w:val="1F3864"/>
+                <w:sz w:val="19"/>
+              </w:rPr>
+              <w:t>visión computacional aplicada</w:t>
+            </w:r>
+            <w:r>
+              <w:rPr>
+                <w:rFonts w:ascii="Calibri" w:hAnsi="Calibri"/>
+                <w:color w:val="1F3864"/>
+                <w:sz w:val="19"/>
+              </w:rPr>
+              <w:t>, automatización y aseguramiento de calidad.</w:t>
             </w:r>
           </w:p>
         </w:tc>
@@ -2345,7 +1647,7 @@
 </file>
 
 <file path=word/endnotes.xml><?xml version="1.0" encoding="utf-8"?>
-<w:endnotes xmlns:wpc="http://schemas.microsoft.com/office/word/2010/wordprocessingCanvas" xmlns:cx="http://schemas.microsoft.com/office/drawing/2014/chartex" xmlns:mc="http://schemas.openxmlformats.org/markup-compatibility/2006" xmlns:o="urn:schemas-microsoft-com:office:office" xmlns:r="http://schemas.openxmlformats.org/officeDocument/2006/relationships" xmlns:m="http://schemas.openxmlformats.org/officeDocument/2006/math" xmlns:v="urn:schemas-microsoft-com:vml" xmlns:wp14="http://schemas.microsoft.com/office/word/2010/wordprocessingDrawing" xmlns:wp="http://schemas.openxmlformats.org/drawingml/2006/wordprocessingDrawing" xmlns:w10="urn:schemas-microsoft-com:office:word" xmlns:w="http://schemas.openxmlformats.org/wordprocessingml/2006/main" xmlns:w14="http://schemas.microsoft.com/office/word/2010/wordml" xmlns:w15="http://schemas.microsoft.com/office/word/2012/wordml" xmlns:w16se="http://schemas.microsoft.com/office/word/2015/wordml/symex" xmlns:wpg="http://schemas.microsoft.com/office/word/2010/wordprocessingGroup" xmlns:wpi="http://schemas.microsoft.com/office/word/2010/wordprocessingInk" xmlns:wne="http://schemas.microsoft.com/office/word/2006/wordml" xmlns:wps="http://schemas.microsoft.com/office/word/2010/wordprocessingShape" mc:Ignorable="w14 w15 w16se wp14">
+<w:endnotes xmlns:wpc="http://schemas.microsoft.com/office/word/2010/wordprocessingCanvas" xmlns:cx="http://schemas.microsoft.com/office/drawing/2014/chartex" xmlns:cx1="http://schemas.microsoft.com/office/drawing/2015/9/8/chartex" xmlns:cx2="http://schemas.microsoft.com/office/drawing/2015/10/21/chartex" xmlns:cx3="http://schemas.microsoft.com/office/drawing/2016/5/9/chartex" xmlns:cx4="http://schemas.microsoft.com/office/drawing/2016/5/10/chartex" xmlns:cx5="http://schemas.microsoft.com/office/drawing/2016/5/11/chartex" xmlns:cx6="http://schemas.microsoft.com/office/drawing/2016/5/12/chartex" xmlns:cx7="http://schemas.microsoft.com/office/drawing/2016/5/13/chartex" xmlns:cx8="http://schemas.microsoft.com/office/drawing/2016/5/14/chartex" xmlns:mc="http://schemas.openxmlformats.org/markup-compatibility/2006" xmlns:aink="http://schemas.microsoft.com/office/drawing/2016/ink" xmlns:am3d="http://schemas.microsoft.com/office/drawing/2017/model3d" xmlns:o="urn:schemas-microsoft-com:office:office" xmlns:oel="http://schemas.microsoft.com/office/2019/extlst" xmlns:r="http://schemas.openxmlformats.org/officeDocument/2006/relationships" xmlns:m="http://schemas.openxmlformats.org/officeDocument/2006/math" xmlns:v="urn:schemas-microsoft-com:vml" xmlns:wp14="http://schemas.microsoft.com/office/word/2010/wordprocessingDrawing" xmlns:wp="http://schemas.openxmlformats.org/drawingml/2006/wordprocessingDrawing" xmlns:w10="urn:schemas-microsoft-com:office:word" xmlns:w="http://schemas.openxmlformats.org/wordprocessingml/2006/main" xmlns:w14="http://schemas.microsoft.com/office/word/2010/wordml" xmlns:w15="http://schemas.microsoft.com/office/word/2012/wordml" xmlns:w16cex="http://schemas.microsoft.com/office/word/2018/wordml/cex" xmlns:w16cid="http://schemas.microsoft.com/office/word/2016/wordml/cid" xmlns:w16="http://schemas.microsoft.com/office/word/2018/wordml" xmlns:w16du="http://schemas.microsoft.com/office/word/2023/wordml/word16du" xmlns:w16sdtdh="http://schemas.microsoft.com/office/word/2020/wordml/sdtdatahash" xmlns:w16sdtfl="http://schemas.microsoft.com/office/word/2024/wordml/sdtformatlock" xmlns:w16se="http://schemas.microsoft.com/office/word/2015/wordml/symex" xmlns:wpg="http://schemas.microsoft.com/office/word/2010/wordprocessingGroup" xmlns:wpi="http://schemas.microsoft.com/office/word/2010/wordprocessingInk" xmlns:wne="http://schemas.microsoft.com/office/word/2006/wordml" xmlns:wps="http://schemas.microsoft.com/office/word/2010/wordprocessingShape" mc:Ignorable="w14 w15 w16se w16cid w16 w16cex w16sdtdh w16sdtfl w16du wp14">
   <w:endnote w:type="separator" w:id="-1">
     <w:p>
       <w:pPr>
@@ -2370,7 +1672,7 @@
 </file>
 
 <file path=word/footnotes.xml><?xml version="1.0" encoding="utf-8"?>
-<w:footnotes xmlns:wpc="http://schemas.microsoft.com/office/word/2010/wordprocessingCanvas" xmlns:cx="http://schemas.microsoft.com/office/drawing/2014/chartex" xmlns:mc="http://schemas.openxmlformats.org/markup-compatibility/2006" xmlns:o="urn:schemas-microsoft-com:office:office" xmlns:r="http://schemas.openxmlformats.org/officeDocument/2006/relationships" xmlns:m="http://schemas.openxmlformats.org/officeDocument/2006/math" xmlns:v="urn:schemas-microsoft-com:vml" xmlns:wp14="http://schemas.microsoft.com/office/word/2010/wordprocessingDrawing" xmlns:wp="http://schemas.openxmlformats.org/drawingml/2006/wordprocessingDrawing" xmlns:w10="urn:schemas-microsoft-com:office:word" xmlns:w="http://schemas.openxmlformats.org/wordprocessingml/2006/main" xmlns:w14="http://schemas.microsoft.com/office/word/2010/wordml" xmlns:w15="http://schemas.microsoft.com/office/word/2012/wordml" xmlns:w16se="http://schemas.microsoft.com/office/word/2015/wordml/symex" xmlns:wpg="http://schemas.microsoft.com/office/word/2010/wordprocessingGroup" xmlns:wpi="http://schemas.microsoft.com/office/word/2010/wordprocessingInk" xmlns:wne="http://schemas.microsoft.com/office/word/2006/wordml" xmlns:wps="http://schemas.microsoft.com/office/word/2010/wordprocessingShape" mc:Ignorable="w14 w15 w16se wp14">
+<w:footnotes xmlns:wpc="http://schemas.microsoft.com/office/word/2010/wordprocessingCanvas" xmlns:cx="http://schemas.microsoft.com/office/drawing/2014/chartex" xmlns:cx1="http://schemas.microsoft.com/office/drawing/2015/9/8/chartex" xmlns:cx2="http://schemas.microsoft.com/office/drawing/2015/10/21/chartex" xmlns:cx3="http://schemas.microsoft.com/office/drawing/2016/5/9/chartex" xmlns:cx4="http://schemas.microsoft.com/office/drawing/2016/5/10/chartex" xmlns:cx5="http://schemas.microsoft.com/office/drawing/2016/5/11/chartex" xmlns:cx6="http://schemas.microsoft.com/office/drawing/2016/5/12/chartex" xmlns:cx7="http://schemas.microsoft.com/office/drawing/2016/5/13/chartex" xmlns:cx8="http://schemas.microsoft.com/office/drawing/2016/5/14/chartex" xmlns:mc="http://schemas.openxmlformats.org/markup-compatibility/2006" xmlns:aink="http://schemas.microsoft.com/office/drawing/2016/ink" xmlns:am3d="http://schemas.microsoft.com/office/drawing/2017/model3d" xmlns:o="urn:schemas-microsoft-com:office:office" xmlns:oel="http://schemas.microsoft.com/office/2019/extlst" xmlns:r="http://schemas.openxmlformats.org/officeDocument/2006/relationships" xmlns:m="http://schemas.openxmlformats.org/officeDocument/2006/math" xmlns:v="urn:schemas-microsoft-com:vml" xmlns:wp14="http://schemas.microsoft.com/office/word/2010/wordprocessingDrawing" xmlns:wp="http://schemas.openxmlformats.org/drawingml/2006/wordprocessingDrawing" xmlns:w10="urn:schemas-microsoft-com:office:word" xmlns:w="http://schemas.openxmlformats.org/wordprocessingml/2006/main" xmlns:w14="http://schemas.microsoft.com/office/word/2010/wordml" xmlns:w15="http://schemas.microsoft.com/office/word/2012/wordml" xmlns:w16cex="http://schemas.microsoft.com/office/word/2018/wordml/cex" xmlns:w16cid="http://schemas.microsoft.com/office/word/2016/wordml/cid" xmlns:w16="http://schemas.microsoft.com/office/word/2018/wordml" xmlns:w16du="http://schemas.microsoft.com/office/word/2023/wordml/word16du" xmlns:w16sdtdh="http://schemas.microsoft.com/office/word/2020/wordml/sdtdatahash" xmlns:w16sdtfl="http://schemas.microsoft.com/office/word/2024/wordml/sdtformatlock" xmlns:w16se="http://schemas.microsoft.com/office/word/2015/wordml/symex" xmlns:wpg="http://schemas.microsoft.com/office/word/2010/wordprocessingGroup" xmlns:wpi="http://schemas.microsoft.com/office/word/2010/wordprocessingInk" xmlns:wne="http://schemas.microsoft.com/office/word/2006/wordml" xmlns:wps="http://schemas.microsoft.com/office/word/2010/wordprocessingShape" mc:Ignorable="w14 w15 w16se w16cid w16 w16cex w16sdtdh w16sdtfl w16du wp14">
   <w:footnote w:type="separator" w:id="-1">
     <w:p>
       <w:pPr>
@@ -2395,12 +1697,11 @@
 </file>
 
 <file path=word/header1.xml><?xml version="1.0" encoding="utf-8"?>
-<w:hdr xmlns:wpc="http://schemas.microsoft.com/office/word/2010/wordprocessingCanvas" xmlns:cx="http://schemas.microsoft.com/office/drawing/2014/chartex" xmlns:mc="http://schemas.openxmlformats.org/markup-compatibility/2006" xmlns:o="urn:schemas-microsoft-com:office:office" xmlns:r="http://schemas.openxmlformats.org/officeDocument/2006/relationships" xmlns:m="http://schemas.openxmlformats.org/officeDocument/2006/math" xmlns:v="urn:schemas-microsoft-com:vml" xmlns:wp14="http://schemas.microsoft.com/office/word/2010/wordprocessingDrawing" xmlns:wp="http://schemas.openxmlformats.org/drawingml/2006/wordprocessingDrawing" xmlns:w10="urn:schemas-microsoft-com:office:word" xmlns:w="http://schemas.openxmlformats.org/wordprocessingml/2006/main" xmlns:w14="http://schemas.microsoft.com/office/word/2010/wordml" xmlns:w15="http://schemas.microsoft.com/office/word/2012/wordml" xmlns:w16se="http://schemas.microsoft.com/office/word/2015/wordml/symex" xmlns:wpg="http://schemas.microsoft.com/office/word/2010/wordprocessingGroup" xmlns:wpi="http://schemas.microsoft.com/office/word/2010/wordprocessingInk" xmlns:wne="http://schemas.microsoft.com/office/word/2006/wordml" xmlns:wps="http://schemas.microsoft.com/office/word/2010/wordprocessingShape" mc:Ignorable="w14 w15 w16se wp14">
+<w:hdr xmlns:wpc="http://schemas.microsoft.com/office/word/2010/wordprocessingCanvas" xmlns:cx="http://schemas.microsoft.com/office/drawing/2014/chartex" xmlns:cx1="http://schemas.microsoft.com/office/drawing/2015/9/8/chartex" xmlns:cx2="http://schemas.microsoft.com/office/drawing/2015/10/21/chartex" xmlns:cx3="http://schemas.microsoft.com/office/drawing/2016/5/9/chartex" xmlns:cx4="http://schemas.microsoft.com/office/drawing/2016/5/10/chartex" xmlns:cx5="http://schemas.microsoft.com/office/drawing/2016/5/11/chartex" xmlns:cx6="http://schemas.microsoft.com/office/drawing/2016/5/12/chartex" xmlns:cx7="http://schemas.microsoft.com/office/drawing/2016/5/13/chartex" xmlns:cx8="http://schemas.microsoft.com/office/drawing/2016/5/14/chartex" xmlns:mc="http://schemas.openxmlformats.org/markup-compatibility/2006" xmlns:aink="http://schemas.microsoft.com/office/drawing/2016/ink" xmlns:am3d="http://schemas.microsoft.com/office/drawing/2017/model3d" xmlns:o="urn:schemas-microsoft-com:office:office" xmlns:oel="http://schemas.microsoft.com/office/2019/extlst" xmlns:r="http://schemas.openxmlformats.org/officeDocument/2006/relationships" xmlns:m="http://schemas.openxmlformats.org/officeDocument/2006/math" xmlns:v="urn:schemas-microsoft-com:vml" xmlns:wp14="http://schemas.microsoft.com/office/word/2010/wordprocessingDrawing" xmlns:wp="http://schemas.openxmlformats.org/drawingml/2006/wordprocessingDrawing" xmlns:w10="urn:schemas-microsoft-com:office:word" xmlns:w="http://schemas.openxmlformats.org/wordprocessingml/2006/main" xmlns:w14="http://schemas.microsoft.com/office/word/2010/wordml" xmlns:w15="http://schemas.microsoft.com/office/word/2012/wordml" xmlns:w16cex="http://schemas.microsoft.com/office/word/2018/wordml/cex" xmlns:w16cid="http://schemas.microsoft.com/office/word/2016/wordml/cid" xmlns:w16="http://schemas.microsoft.com/office/word/2018/wordml" xmlns:w16du="http://schemas.microsoft.com/office/word/2023/wordml/word16du" xmlns:w16sdtdh="http://schemas.microsoft.com/office/word/2020/wordml/sdtdatahash" xmlns:w16sdtfl="http://schemas.microsoft.com/office/word/2024/wordml/sdtformatlock" xmlns:w16se="http://schemas.microsoft.com/office/word/2015/wordml/symex" xmlns:wpg="http://schemas.microsoft.com/office/word/2010/wordprocessingGroup" xmlns:wpi="http://schemas.microsoft.com/office/word/2010/wordprocessingInk" xmlns:wne="http://schemas.microsoft.com/office/word/2006/wordml" xmlns:wps="http://schemas.microsoft.com/office/word/2010/wordprocessingShape" mc:Ignorable="w14 w15 w16se w16cid w16 w16cex w16sdtdh w16sdtfl w16du wp14">
   <w:tbl>
     <w:tblPr>
       <w:tblStyle w:val="Tablaconcuadrcula1"/>
       <w:tblW w:w="9923" w:type="dxa"/>
-      <w:tblInd w:w="-709" w:type="dxa"/>
       <w:tblLook w:val="04A0" w:firstRow="1" w:lastRow="0" w:firstColumn="1" w:lastColumn="0" w:noHBand="0" w:noVBand="1"/>
     </w:tblPr>
     <w:tblGrid>
@@ -2620,7 +1921,7 @@
 </file>
 
 <file path=word/numbering.xml><?xml version="1.0" encoding="utf-8"?>
-<w:numbering xmlns:wpc="http://schemas.microsoft.com/office/word/2010/wordprocessingCanvas" xmlns:cx="http://schemas.microsoft.com/office/drawing/2014/chartex" xmlns:mc="http://schemas.openxmlformats.org/markup-compatibility/2006" xmlns:o="urn:schemas-microsoft-com:office:office" xmlns:r="http://schemas.openxmlformats.org/officeDocument/2006/relationships" xmlns:m="http://schemas.openxmlformats.org/officeDocument/2006/math" xmlns:v="urn:schemas-microsoft-com:vml" xmlns:wp14="http://schemas.microsoft.com/office/word/2010/wordprocessingDrawing" xmlns:wp="http://schemas.openxmlformats.org/drawingml/2006/wordprocessingDrawing" xmlns:w10="urn:schemas-microsoft-com:office:word" xmlns:w="http://schemas.openxmlformats.org/wordprocessingml/2006/main" xmlns:w14="http://schemas.microsoft.com/office/word/2010/wordml" xmlns:w15="http://schemas.microsoft.com/office/word/2012/wordml" xmlns:w16se="http://schemas.microsoft.com/office/word/2015/wordml/symex" xmlns:wpg="http://schemas.microsoft.com/office/word/2010/wordprocessingGroup" xmlns:wpi="http://schemas.microsoft.com/office/word/2010/wordprocessingInk" xmlns:wne="http://schemas.microsoft.com/office/word/2006/wordml" xmlns:wps="http://schemas.microsoft.com/office/word/2010/wordprocessingShape" mc:Ignorable="w14 w15 w16se wp14">
+<w:numbering xmlns:wpc="http://schemas.microsoft.com/office/word/2010/wordprocessingCanvas" xmlns:cx="http://schemas.microsoft.com/office/drawing/2014/chartex" xmlns:cx1="http://schemas.microsoft.com/office/drawing/2015/9/8/chartex" xmlns:cx2="http://schemas.microsoft.com/office/drawing/2015/10/21/chartex" xmlns:cx3="http://schemas.microsoft.com/office/drawing/2016/5/9/chartex" xmlns:cx4="http://schemas.microsoft.com/office/drawing/2016/5/10/chartex" xmlns:cx5="http://schemas.microsoft.com/office/drawing/2016/5/11/chartex" xmlns:cx6="http://schemas.microsoft.com/office/drawing/2016/5/12/chartex" xmlns:cx7="http://schemas.microsoft.com/office/drawing/2016/5/13/chartex" xmlns:cx8="http://schemas.microsoft.com/office/drawing/2016/5/14/chartex" xmlns:mc="http://schemas.openxmlformats.org/markup-compatibility/2006" xmlns:aink="http://schemas.microsoft.com/office/drawing/2016/ink" xmlns:am3d="http://schemas.microsoft.com/office/drawing/2017/model3d" xmlns:o="urn:schemas-microsoft-com:office:office" xmlns:oel="http://schemas.microsoft.com/office/2019/extlst" xmlns:r="http://schemas.openxmlformats.org/officeDocument/2006/relationships" xmlns:m="http://schemas.openxmlformats.org/officeDocument/2006/math" xmlns:v="urn:schemas-microsoft-com:vml" xmlns:wp14="http://schemas.microsoft.com/office/word/2010/wordprocessingDrawing" xmlns:wp="http://schemas.openxmlformats.org/drawingml/2006/wordprocessingDrawing" xmlns:w10="urn:schemas-microsoft-com:office:word" xmlns:w="http://schemas.openxmlformats.org/wordprocessingml/2006/main" xmlns:w14="http://schemas.microsoft.com/office/word/2010/wordml" xmlns:w15="http://schemas.microsoft.com/office/word/2012/wordml" xmlns:w16cex="http://schemas.microsoft.com/office/word/2018/wordml/cex" xmlns:w16cid="http://schemas.microsoft.com/office/word/2016/wordml/cid" xmlns:w16="http://schemas.microsoft.com/office/word/2018/wordml" xmlns:w16du="http://schemas.microsoft.com/office/word/2023/wordml/word16du" xmlns:w16sdtdh="http://schemas.microsoft.com/office/word/2020/wordml/sdtdatahash" xmlns:w16sdtfl="http://schemas.microsoft.com/office/word/2024/wordml/sdtformatlock" xmlns:w16se="http://schemas.microsoft.com/office/word/2015/wordml/symex" xmlns:wpg="http://schemas.microsoft.com/office/word/2010/wordprocessingGroup" xmlns:wpi="http://schemas.microsoft.com/office/word/2010/wordprocessingInk" xmlns:wne="http://schemas.microsoft.com/office/word/2006/wordml" xmlns:wps="http://schemas.microsoft.com/office/word/2010/wordprocessingShape" mc:Ignorable="w14 w15 w16se w16cid w16 w16cex w16sdtdh w16sdtfl w16du wp14">
   <w:abstractNum w:abstractNumId="0" w15:restartNumberingAfterBreak="0">
     <w:nsid w:val="114E14AF"/>
     <w:multiLevelType w:val="hybridMultilevel"/>
@@ -3320,29 +2621,29 @@
       </w:pPr>
     </w:lvl>
   </w:abstractNum>
-  <w:num w:numId="1">
+  <w:num w:numId="1" w16cid:durableId="1770539944">
     <w:abstractNumId w:val="0"/>
   </w:num>
-  <w:num w:numId="2">
+  <w:num w:numId="2" w16cid:durableId="188226932">
     <w:abstractNumId w:val="2"/>
   </w:num>
-  <w:num w:numId="3">
+  <w:num w:numId="3" w16cid:durableId="525339182">
     <w:abstractNumId w:val="5"/>
   </w:num>
-  <w:num w:numId="4">
+  <w:num w:numId="4" w16cid:durableId="585848255">
     <w:abstractNumId w:val="1"/>
   </w:num>
-  <w:num w:numId="5">
+  <w:num w:numId="5" w16cid:durableId="1637762691">
     <w:abstractNumId w:val="3"/>
   </w:num>
-  <w:num w:numId="6">
+  <w:num w:numId="6" w16cid:durableId="1377583135">
     <w:abstractNumId w:val="4"/>
   </w:num>
 </w:numbering>
 </file>
 
 <file path=word/styles.xml><?xml version="1.0" encoding="utf-8"?>
-<w:styles xmlns:mc="http://schemas.openxmlformats.org/markup-compatibility/2006" xmlns:r="http://schemas.openxmlformats.org/officeDocument/2006/relationships" xmlns:w="http://schemas.openxmlformats.org/wordprocessingml/2006/main" xmlns:w14="http://schemas.microsoft.com/office/word/2010/wordml" xmlns:w15="http://schemas.microsoft.com/office/word/2012/wordml" xmlns:w16se="http://schemas.microsoft.com/office/word/2015/wordml/symex" mc:Ignorable="w14 w15 w16se">
+<w:styles xmlns:mc="http://schemas.openxmlformats.org/markup-compatibility/2006" xmlns:r="http://schemas.openxmlformats.org/officeDocument/2006/relationships" xmlns:w="http://schemas.openxmlformats.org/wordprocessingml/2006/main" xmlns:w14="http://schemas.microsoft.com/office/word/2010/wordml" xmlns:w15="http://schemas.microsoft.com/office/word/2012/wordml" xmlns:w16cex="http://schemas.microsoft.com/office/word/2018/wordml/cex" xmlns:w16cid="http://schemas.microsoft.com/office/word/2016/wordml/cid" xmlns:w16="http://schemas.microsoft.com/office/word/2018/wordml" xmlns:w16du="http://schemas.microsoft.com/office/word/2023/wordml/word16du" xmlns:w16sdtdh="http://schemas.microsoft.com/office/word/2020/wordml/sdtdatahash" xmlns:w16sdtfl="http://schemas.microsoft.com/office/word/2024/wordml/sdtformatlock" xmlns:w16se="http://schemas.microsoft.com/office/word/2015/wordml/symex" mc:Ignorable="w14 w15 w16se w16cid w16 w16cex w16sdtdh w16sdtfl w16du">
   <w:docDefaults>
     <w:rPrDefault>
       <w:rPr>
@@ -3354,7 +2655,7 @@
     </w:rPrDefault>
     <w:pPrDefault/>
   </w:docDefaults>
-  <w:latentStyles w:defLockedState="0" w:defUIPriority="99" w:defSemiHidden="0" w:defUnhideWhenUsed="0" w:defQFormat="0" w:count="371">
+  <w:latentStyles w:defLockedState="0" w:defUIPriority="99" w:defSemiHidden="0" w:defUnhideWhenUsed="0" w:defQFormat="0" w:count="376">
     <w:lsdException w:name="Normal" w:uiPriority="0" w:qFormat="1"/>
     <w:lsdException w:name="heading 1" w:uiPriority="9" w:qFormat="1"/>
     <w:lsdException w:name="heading 2" w:semiHidden="1" w:uiPriority="9" w:unhideWhenUsed="1" w:qFormat="1"/>
@@ -3726,6 +3027,11 @@
     <w:lsdException w:name="List Table 5 Dark Accent 6" w:uiPriority="50"/>
     <w:lsdException w:name="List Table 6 Colorful Accent 6" w:uiPriority="51"/>
     <w:lsdException w:name="List Table 7 Colorful Accent 6" w:uiPriority="52"/>
+    <w:lsdException w:name="Mention" w:semiHidden="1" w:unhideWhenUsed="1"/>
+    <w:lsdException w:name="Smart Hyperlink" w:semiHidden="1" w:unhideWhenUsed="1"/>
+    <w:lsdException w:name="Hashtag" w:semiHidden="1" w:unhideWhenUsed="1"/>
+    <w:lsdException w:name="Unresolved Mention" w:semiHidden="1" w:unhideWhenUsed="1"/>
+    <w:lsdException w:name="Smart Link" w:semiHidden="1" w:unhideWhenUsed="1"/>
   </w:latentStyles>
   <w:style w:type="paragraph" w:default="1" w:styleId="Normal">
     <w:name w:val="Normal"/>
@@ -4335,6 +3641,21 @@
 </file>
 
 <file path=customXml/item1.xml><?xml version="1.0" encoding="utf-8"?>
+<?mso-contentType ?>
+<FormTemplates xmlns="http://schemas.microsoft.com/sharepoint/v3/contenttype/forms">
+  <Display>DocumentLibraryForm</Display>
+  <Edit>DocumentLibraryForm</Edit>
+  <New>DocumentLibraryForm</New>
+</FormTemplates>
+</file>
+
+<file path=customXml/item2.xml><?xml version="1.0" encoding="utf-8"?>
+<p:properties xmlns:p="http://schemas.microsoft.com/office/2006/metadata/properties" xmlns:xsi="http://www.w3.org/2001/XMLSchema-instance" xmlns:pc="http://schemas.microsoft.com/office/infopath/2007/PartnerControls">
+  <documentManagement/>
+</p:properties>
+</file>
+
+<file path=customXml/item3.xml><?xml version="1.0" encoding="utf-8"?>
 <ct:contentTypeSchema xmlns:ct="http://schemas.microsoft.com/office/2006/metadata/contentType" xmlns:ma="http://schemas.microsoft.com/office/2006/metadata/properties/metaAttributes" ct:_="" ma:_="" ma:contentTypeName="Documento" ma:contentTypeID="0x010100E96778489EE7714D8BD12CC105EB918B" ma:contentTypeVersion="2" ma:contentTypeDescription="Crear nuevo documento." ma:contentTypeScope="" ma:versionID="416c5c7ae9b5d54d83875cd3c65194e3">
   <xsd:schema xmlns:xsd="http://www.w3.org/2001/XMLSchema" xmlns:xs="http://www.w3.org/2001/XMLSchema" xmlns:p="http://schemas.microsoft.com/office/2006/metadata/properties" xmlns:ns2="126e8a1c-9ea9-435a-ac89-d06c80d62e30" targetNamespace="http://schemas.microsoft.com/office/2006/metadata/properties" ma:root="true" ma:fieldsID="70a237c842677bd850644f8595079f5e" ns2:_="">
     <xsd:import namespace="126e8a1c-9ea9-435a-ac89-d06c80d62e30"/>
@@ -4466,26 +3787,28 @@
 </ct:contentTypeSchema>
 </file>
 
-<file path=customXml/item2.xml><?xml version="1.0" encoding="utf-8"?>
-<p:properties xmlns:p="http://schemas.microsoft.com/office/2006/metadata/properties" xmlns:xsi="http://www.w3.org/2001/XMLSchema-instance" xmlns:pc="http://schemas.microsoft.com/office/infopath/2007/PartnerControls">
-  <documentManagement/>
-</p:properties>
-</file>
-
-<file path=customXml/item3.xml><?xml version="1.0" encoding="utf-8"?>
-<?mso-contentType ?>
-<FormTemplates xmlns="http://schemas.microsoft.com/sharepoint/v3/contenttype/forms">
-  <Display>DocumentLibraryForm</Display>
-  <Edit>DocumentLibraryForm</Edit>
-  <New>DocumentLibraryForm</New>
-</FormTemplates>
-</file>
-
 <file path=customXml/item4.xml><?xml version="1.0" encoding="utf-8"?>
 <b:Sources xmlns:b="http://schemas.openxmlformats.org/officeDocument/2006/bibliography" xmlns="http://schemas.openxmlformats.org/officeDocument/2006/bibliography" SelectedStyle="\APASixthEditionOfficeOnline.xsl" StyleName="APA" Version="6"/>
 </file>
 
 <file path=customXml/itemProps1.xml><?xml version="1.0" encoding="utf-8"?>
+<ds:datastoreItem xmlns:ds="http://schemas.openxmlformats.org/officeDocument/2006/customXml" ds:itemID="{DB26575A-B7B3-4412-B642-D3B0845180CC}">
+  <ds:schemaRefs>
+    <ds:schemaRef ds:uri="http://schemas.microsoft.com/sharepoint/v3/contenttype/forms"/>
+  </ds:schemaRefs>
+</ds:datastoreItem>
+</file>
+
+<file path=customXml/itemProps2.xml><?xml version="1.0" encoding="utf-8"?>
+<ds:datastoreItem xmlns:ds="http://schemas.openxmlformats.org/officeDocument/2006/customXml" ds:itemID="{372B79FC-6971-4544-98C5-83069028712A}">
+  <ds:schemaRefs>
+    <ds:schemaRef ds:uri="http://schemas.microsoft.com/office/2006/metadata/properties"/>
+    <ds:schemaRef ds:uri="http://schemas.microsoft.com/office/infopath/2007/PartnerControls"/>
+  </ds:schemaRefs>
+</ds:datastoreItem>
+</file>
+
+<file path=customXml/itemProps3.xml><?xml version="1.0" encoding="utf-8"?>
 <ds:datastoreItem xmlns:ds="http://schemas.openxmlformats.org/officeDocument/2006/customXml" ds:itemID="{1A4E63CB-0BBC-477D-B96D-0B1E89CFECED}">
   <ds:schemaRefs>
     <ds:schemaRef ds:uri="http://schemas.microsoft.com/office/2006/metadata/contentType"/>
@@ -4503,30 +3826,6 @@
 </ds:datastoreItem>
 </file>
 
-<file path=customXml/itemProps2.xml><?xml version="1.0" encoding="utf-8"?>
-<ds:datastoreItem xmlns:ds="http://schemas.openxmlformats.org/officeDocument/2006/customXml" ds:itemID="{372B79FC-6971-4544-98C5-83069028712A}">
-  <ds:schemaRefs>
-    <ds:schemaRef ds:uri="http://purl.org/dc/dcmitype/"/>
-    <ds:schemaRef ds:uri="http://purl.org/dc/elements/1.1/"/>
-    <ds:schemaRef ds:uri="http://www.w3.org/XML/1998/namespace"/>
-    <ds:schemaRef ds:uri="126e8a1c-9ea9-435a-ac89-d06c80d62e30"/>
-    <ds:schemaRef ds:uri="http://schemas.microsoft.com/office/2006/documentManagement/types"/>
-    <ds:schemaRef ds:uri="http://purl.org/dc/terms/"/>
-    <ds:schemaRef ds:uri="http://schemas.microsoft.com/office/infopath/2007/PartnerControls"/>
-    <ds:schemaRef ds:uri="http://schemas.openxmlformats.org/package/2006/metadata/core-properties"/>
-    <ds:schemaRef ds:uri="http://schemas.microsoft.com/office/2006/metadata/properties"/>
-  </ds:schemaRefs>
-</ds:datastoreItem>
-</file>
-
-<file path=customXml/itemProps3.xml><?xml version="1.0" encoding="utf-8"?>
-<ds:datastoreItem xmlns:ds="http://schemas.openxmlformats.org/officeDocument/2006/customXml" ds:itemID="{DB26575A-B7B3-4412-B642-D3B0845180CC}">
-  <ds:schemaRefs>
-    <ds:schemaRef ds:uri="http://schemas.microsoft.com/sharepoint/v3/contenttype/forms"/>
-  </ds:schemaRefs>
-</ds:datastoreItem>
-</file>
-
 <file path=customXml/itemProps4.xml><?xml version="1.0" encoding="utf-8"?>
 <ds:datastoreItem xmlns:ds="http://schemas.openxmlformats.org/officeDocument/2006/customXml" ds:itemID="{BDCED711-E314-4C22-B587-D275DD8897EC}">
   <ds:schemaRefs>

</xml_diff>